<commit_message>
Add the Chapter 3 classroom package for build ch3-factory-2026-10-06.
The package teaches Energy and Speed Are Related through the accepted factory.

Co-authored-by: Cursor <cursoragent@cursor.com>
</commit_message>
<xml_diff>
--- a/production/premium-notes/03-ch3-energy-speed-guided-notes.docx
+++ b/production/premium-notes/03-ch3-energy-speed-guided-notes.docx
@@ -4,77 +4,104 @@
   <w:body>
     <w:p>
       <w:pPr>
-        <w:jc w:val="center"/>
+        <w:spacing w:before="0" w:after="40"/>
       </w:pPr>
       <w:r>
         <w:rPr>
-          <w:rFonts w:ascii="Cambria" w:hAnsi="Cambria" w:cs="Cambria"/>
+          <w:rFonts w:ascii="Avenir Next" w:hAnsi="Avenir Next"/>
           <w:b/>
           <w:i w:val="0"/>
-          <w:color w:val="2F3C7E"/>
-          <w:sz w:val="46"/>
+          <w:color w:val="4A5268"/>
+          <w:sz w:val="24"/>
+          <w:u w:val="none"/>
+          <w:rFonts w:ascii="Avenir Next" w:hAnsi="Avenir Next" w:cs="Avenir Next"/>
         </w:rPr>
-        <w:t>Energy and Speed Are Related</w:t>
+        <w:t>UNIT 1  ·  ENERGY TRANSFER &amp; TRANSFORMATION</w:t>
       </w:r>
     </w:p>
     <w:p>
       <w:pPr>
-        <w:jc w:val="center"/>
+        <w:spacing w:before="0" w:after="40"/>
       </w:pPr>
       <w:r>
         <w:rPr>
-          <w:rFonts w:ascii="Calibri" w:hAnsi="Calibri" w:cs="Calibri"/>
-          <w:b w:val="0"/>
-          <w:i/>
-          <w:color w:val="555555"/>
-          <w:sz w:val="24"/>
+          <w:rFonts w:ascii="Avenir Next" w:hAnsi="Avenir Next"/>
+          <w:b/>
+          <w:i w:val="0"/>
+          <w:color w:val="1B4FC2"/>
+          <w:sz w:val="44"/>
+          <w:u w:val="none"/>
+          <w:rFonts w:ascii="Avenir Next" w:hAnsi="Avenir Next" w:cs="Avenir Next"/>
         </w:rPr>
-        <w:t>Chapter 3 Guided Notes · Grade 4 Energy Transfer &amp; Transformation</w:t>
+        <w:t>Chapter 3  ·  Energy and Speed Are Related</w:t>
       </w:r>
     </w:p>
     <w:p>
       <w:pPr>
-        <w:spacing w:after="40"/>
+        <w:spacing w:before="0" w:after="80"/>
       </w:pPr>
       <w:r>
         <w:rPr>
-          <w:rFonts w:ascii="Calibri" w:hAnsi="Calibri" w:cs="Calibri"/>
+          <w:rFonts w:ascii="Avenir Next" w:hAnsi="Avenir Next"/>
           <w:b/>
           <w:i w:val="0"/>
-          <w:color w:val="1F1F1F"/>
+          <w:color w:val="2B2F36"/>
           <w:sz w:val="24"/>
+          <w:u w:val="none"/>
+          <w:rFonts w:ascii="Avenir Next" w:hAnsi="Avenir Next" w:cs="Avenir Next"/>
+        </w:rPr>
+        <w:t>GUIDED NOTES</w:t>
+      </w:r>
+    </w:p>
+    <w:p>
+      <w:pPr>
+        <w:spacing w:before="0" w:after="120"/>
+      </w:pPr>
+      <w:r>
+        <w:rPr>
+          <w:rFonts w:ascii="Avenir Next" w:hAnsi="Avenir Next"/>
+          <w:b/>
+          <w:i w:val="0"/>
+          <w:color w:val="1A1D26"/>
+          <w:sz w:val="24"/>
+          <w:u w:val="none"/>
+          <w:rFonts w:ascii="Avenir Next" w:hAnsi="Avenir Next" w:cs="Avenir Next"/>
         </w:rPr>
         <w:t xml:space="preserve">Name: </w:t>
       </w:r>
       <w:r>
         <w:rPr>
-          <w:rFonts w:ascii="Calibri" w:hAnsi="Calibri" w:cs="Calibri"/>
+          <w:rFonts w:ascii="Avenir Next" w:hAnsi="Avenir Next"/>
           <w:b w:val="0"/>
           <w:i w:val="0"/>
-          <w:color w:val="1F1F1F"/>
+          <w:color w:val="1A1D26"/>
           <w:sz w:val="24"/>
-          <w:u w:val="single"/>
+          <w:u w:val="none"/>
+          <w:rFonts w:ascii="Avenir Next" w:hAnsi="Avenir Next" w:cs="Avenir Next"/>
         </w:rPr>
         <w:t>____________________________</w:t>
       </w:r>
       <w:r>
         <w:rPr>
-          <w:rFonts w:ascii="Calibri" w:hAnsi="Calibri" w:cs="Calibri"/>
+          <w:rFonts w:ascii="Avenir Next" w:hAnsi="Avenir Next"/>
           <w:b/>
           <w:i w:val="0"/>
-          <w:color w:val="1F1F1F"/>
+          <w:color w:val="1A1D26"/>
           <w:sz w:val="24"/>
+          <w:u w:val="none"/>
+          <w:rFonts w:ascii="Avenir Next" w:hAnsi="Avenir Next" w:cs="Avenir Next"/>
         </w:rPr>
-        <w:t xml:space="preserve">      Date: </w:t>
+        <w:t xml:space="preserve">    Date: </w:t>
       </w:r>
       <w:r>
         <w:rPr>
-          <w:rFonts w:ascii="Calibri" w:hAnsi="Calibri" w:cs="Calibri"/>
+          <w:rFonts w:ascii="Avenir Next" w:hAnsi="Avenir Next"/>
           <w:b w:val="0"/>
           <w:i w:val="0"/>
-          <w:color w:val="1F1F1F"/>
+          <w:color w:val="1A1D26"/>
           <w:sz w:val="24"/>
-          <w:u w:val="single"/>
+          <w:u w:val="none"/>
+          <w:rFonts w:ascii="Avenir Next" w:hAnsi="Avenir Next" w:cs="Avenir Next"/>
         </w:rPr>
         <w:t>________________</w:t>
       </w:r>
@@ -84,50 +111,42 @@
         <w:tblW w:type="auto" w:w="0"/>
         <w:tblLook w:firstColumn="1" w:firstRow="1" w:lastColumn="0" w:lastRow="0" w:noHBand="0" w:noVBand="1" w:val="04A0"/>
         <w:tblBorders>
-          <w:top w:val="none" w:sz="0" w:space="0" w:color="FFFFFF"/>
-          <w:left w:val="none" w:sz="0" w:space="0" w:color="FFFFFF"/>
-          <w:bottom w:val="none" w:sz="0" w:space="0" w:color="FFFFFF"/>
-          <w:right w:val="none" w:sz="0" w:space="0" w:color="FFFFFF"/>
-          <w:insideH w:val="none" w:sz="0" w:space="0" w:color="FFFFFF"/>
-          <w:insideV w:val="none" w:sz="0" w:space="0" w:color="FFFFFF"/>
+          <w:top w:val="none"/>
+          <w:left w:val="none"/>
+          <w:bottom w:val="none"/>
+          <w:right w:val="none"/>
+          <w:insideH w:val="none"/>
+          <w:insideV w:val="none"/>
         </w:tblBorders>
       </w:tblPr>
       <w:tblGrid>
-        <w:gridCol w:w="10080"/>
+        <w:gridCol w:w="10656"/>
       </w:tblGrid>
       <w:tr>
         <w:tc>
           <w:tcPr>
-            <w:tcW w:type="dxa" w:w="10080"/>
+            <w:tcW w:type="dxa" w:w="10656"/>
             <w:tcMar>
-              <w:top w:w="60" w:type="dxa"/>
-              <w:left w:w="120" w:type="dxa"/>
-              <w:bottom w:w="60" w:type="dxa"/>
-              <w:right w:w="120" w:type="dxa"/>
+              <w:top w:w="70" w:type="dxa"/>
+              <w:left w:w="110" w:type="dxa"/>
+              <w:bottom w:w="70" w:type="dxa"/>
+              <w:right w:w="110" w:type="dxa"/>
             </w:tcMar>
-            <w:shd w:fill="2F3C7E"/>
+            <w:shd w:val="clear" w:color="auto" w:fill="1B4FC2"/>
+            <w:vAlign w:val="center"/>
           </w:tcPr>
           <w:p>
             <w:r>
               <w:rPr>
-                <w:rFonts w:ascii="Calibri" w:hAnsi="Calibri" w:cs="Calibri"/>
-                <w:b/>
-                <w:i w:val="0"/>
-                <w:caps/>
-                <w:color w:val="E8C54A"/>
-                <w:sz w:val="26"/>
-              </w:rPr>
-              <w:t xml:space="preserve">BIG QUESTION   </w:t>
-            </w:r>
-            <w:r>
-              <w:rPr>
-                <w:rFonts w:ascii="Calibri" w:hAnsi="Calibri" w:cs="Calibri"/>
+                <w:rFonts w:ascii="Avenir Next" w:hAnsi="Avenir Next"/>
                 <w:b/>
                 <w:i w:val="0"/>
                 <w:color w:val="FFFFFF"/>
                 <w:sz w:val="30"/>
+                <w:u w:val="none"/>
+                <w:rFonts w:ascii="Avenir Next" w:hAnsi="Avenir Next" w:cs="Avenir Next"/>
               </w:rPr>
-              <w:t>How are energy and speed related?</w:t>
+              <w:t>BQ    How are energy and speed related?</w:t>
             </w:r>
           </w:p>
         </w:tc>
@@ -135,75 +154,24 @@
     </w:tbl>
     <w:p>
       <w:pPr>
-        <w:spacing w:after="80"/>
+        <w:spacing w:before="0" w:after="80"/>
       </w:pPr>
     </w:p>
     <w:p>
       <w:pPr>
-        <w:spacing w:before="100" w:after="40"/>
+        <w:spacing w:before="0" w:after="40"/>
       </w:pPr>
       <w:r>
         <w:rPr>
-          <w:rFonts w:ascii="Calibri" w:hAnsi="Calibri" w:cs="Calibri"/>
+          <w:rFonts w:ascii="Avenir Next" w:hAnsi="Avenir Next"/>
           <w:b/>
           <w:i w:val="0"/>
-          <w:caps/>
-          <w:color w:val="2F3C7E"/>
-          <w:sz w:val="32"/>
+          <w:color w:val="1B4FC2"/>
+          <w:sz w:val="29"/>
+          <w:u w:val="none"/>
+          <w:rFonts w:ascii="Avenir Next" w:hAnsi="Avenir Next" w:cs="Avenir Next"/>
         </w:rPr>
-        <w:t>Key Words</w:t>
-      </w:r>
-    </w:p>
-    <w:p>
-      <w:pPr>
-        <w:spacing w:after="60"/>
-      </w:pPr>
-      <w:r>
-        <w:rPr>
-          <w:rFonts w:ascii="Calibri" w:hAnsi="Calibri" w:cs="Calibri"/>
-          <w:b w:val="0"/>
-          <w:i w:val="0"/>
-          <w:color w:val="1F1F1F"/>
-          <w:sz w:val="26"/>
-        </w:rPr>
-        <w:t xml:space="preserve">speed — Speed is a measurement of the </w:t>
-      </w:r>
-      <w:r>
-        <w:rPr>
-          <w:rFonts w:ascii="Calibri" w:hAnsi="Calibri" w:cs="Calibri"/>
-          <w:b w:val="0"/>
-          <w:i w:val="0"/>
-          <w:color w:val="1F1F1F"/>
-          <w:sz w:val="26"/>
-          <w:u w:val="single"/>
-        </w:rPr>
-        <w:t>________________</w:t>
-      </w:r>
-      <w:r>
-        <w:rPr>
-          <w:rFonts w:ascii="Calibri" w:hAnsi="Calibri" w:cs="Calibri"/>
-          <w:b w:val="0"/>
-          <w:i w:val="0"/>
-          <w:color w:val="1F1F1F"/>
-          <w:sz w:val="26"/>
-        </w:rPr>
-        <w:t xml:space="preserve"> an object travels over an amount of time.</w:t>
-      </w:r>
-    </w:p>
-    <w:p>
-      <w:pPr>
-        <w:spacing w:before="100" w:after="40"/>
-      </w:pPr>
-      <w:r>
-        <w:rPr>
-          <w:rFonts w:ascii="Calibri" w:hAnsi="Calibri" w:cs="Calibri"/>
-          <w:b/>
-          <w:i w:val="0"/>
-          <w:caps/>
-          <w:color w:val="2F3C7E"/>
-          <w:sz w:val="32"/>
-        </w:rPr>
-        <w:t>Key Idea</w:t>
+        <w:t>My first thinking</w:t>
       </w:r>
     </w:p>
     <w:tbl>
@@ -211,50 +179,83 @@
         <w:tblW w:type="auto" w:w="0"/>
         <w:tblLook w:firstColumn="1" w:firstRow="1" w:lastColumn="0" w:lastRow="0" w:noHBand="0" w:noVBand="1" w:val="04A0"/>
         <w:tblBorders>
-          <w:top w:val="none" w:sz="0" w:space="0" w:color="FFFFFF"/>
-          <w:left w:val="none" w:sz="0" w:space="0" w:color="FFFFFF"/>
-          <w:bottom w:val="none" w:sz="0" w:space="0" w:color="FFFFFF"/>
-          <w:right w:val="none" w:sz="0" w:space="0" w:color="FFFFFF"/>
-          <w:insideH w:val="none" w:sz="0" w:space="0" w:color="FFFFFF"/>
-          <w:insideV w:val="none" w:sz="0" w:space="0" w:color="FFFFFF"/>
+          <w:top w:val="none"/>
+          <w:left w:val="none"/>
+          <w:bottom w:val="none"/>
+          <w:right w:val="none"/>
+          <w:insideH w:val="none"/>
+          <w:insideV w:val="none"/>
         </w:tblBorders>
       </w:tblPr>
       <w:tblGrid>
-        <w:gridCol w:w="10080"/>
+        <w:gridCol w:w="10656"/>
       </w:tblGrid>
       <w:tr>
+        <w:trPr>
+          <w:trHeight w:val="560" w:hRule="exact"/>
+        </w:trPr>
         <w:tc>
           <w:tcPr>
-            <w:tcW w:type="dxa" w:w="10080"/>
+            <w:tcW w:type="dxa" w:w="10656"/>
             <w:tcMar>
-              <w:top w:w="50" w:type="dxa"/>
-              <w:left w:w="100" w:type="dxa"/>
-              <w:bottom w:w="50" w:type="dxa"/>
-              <w:right w:w="100" w:type="dxa"/>
+              <w:top w:w="0" w:type="dxa"/>
+              <w:left w:w="0" w:type="dxa"/>
+              <w:bottom w:w="0" w:type="dxa"/>
+              <w:right w:w="0" w:type="dxa"/>
             </w:tcMar>
-            <w:shd w:fill="E8EAF2"/>
+            <w:tcBorders>
+              <w:bottom w:val="single" w:sz="8" w:color="1A1D26"/>
+            </w:tcBorders>
           </w:tcPr>
           <w:p>
+            <w:pPr>
+              <w:spacing w:before="0" w:after="0" w:line="40" w:lineRule="exact"/>
+            </w:pPr>
             <w:r>
               <w:rPr>
-                <w:rFonts w:ascii="Calibri" w:hAnsi="Calibri" w:cs="Calibri"/>
-                <w:b/>
+                <w:rFonts w:ascii="Avenir Next" w:hAnsi="Avenir Next"/>
+                <w:b w:val="0"/>
                 <w:i w:val="0"/>
-                <w:caps/>
-                <w:color w:val="C03D3D"/>
-                <w:sz w:val="24"/>
+                <w:color w:val="1A1D26"/>
+                <w:sz w:val="4"/>
+                <w:u w:val="none"/>
+                <w:rFonts w:ascii="Avenir Next" w:hAnsi="Avenir Next" w:cs="Avenir Next"/>
               </w:rPr>
-              <w:t xml:space="preserve">KEY IDEA   </w:t>
             </w:r>
+          </w:p>
+        </w:tc>
+      </w:tr>
+      <w:tr>
+        <w:trPr>
+          <w:trHeight w:val="560" w:hRule="exact"/>
+        </w:trPr>
+        <w:tc>
+          <w:tcPr>
+            <w:tcW w:type="dxa" w:w="10656"/>
+            <w:tcMar>
+              <w:top w:w="0" w:type="dxa"/>
+              <w:left w:w="0" w:type="dxa"/>
+              <w:bottom w:w="0" w:type="dxa"/>
+              <w:right w:w="0" w:type="dxa"/>
+            </w:tcMar>
+            <w:tcBorders>
+              <w:bottom w:val="single" w:sz="8" w:color="1A1D26"/>
+            </w:tcBorders>
+          </w:tcPr>
+          <w:p>
+            <w:pPr>
+              <w:spacing w:before="0" w:after="0" w:line="40" w:lineRule="exact"/>
+            </w:pPr>
             <w:r>
               <w:rPr>
-                <w:rFonts w:ascii="Calibri" w:hAnsi="Calibri" w:cs="Calibri"/>
-                <w:b/>
+                <w:rFonts w:ascii="Avenir Next" w:hAnsi="Avenir Next"/>
+                <w:b w:val="0"/>
                 <w:i w:val="0"/>
-                <w:color w:val="1F1F1F"/>
-                <w:sz w:val="28"/>
+                <w:color w:val="1A1D26"/>
+                <w:sz w:val="4"/>
+                <w:u w:val="none"/>
+                <w:rFonts w:ascii="Avenir Next" w:hAnsi="Avenir Next" w:cs="Avenir Next"/>
               </w:rPr>
-              <w:t>For the SAME object, faster motion means MORE energy of motion than slower motion.</w:t>
             </w:r>
           </w:p>
         </w:tc>
@@ -262,97 +263,263 @@
     </w:tbl>
     <w:p>
       <w:pPr>
-        <w:spacing w:after="40"/>
-      </w:pPr>
-    </w:p>
-    <w:p>
-      <w:pPr>
-        <w:spacing w:before="100" w:after="40"/>
+        <w:spacing w:before="160" w:after="40"/>
+        <w:pBdr>
+          <w:bottom w:val="single" w:sz="10" w:color="1B4FC2"/>
+        </w:pBdr>
       </w:pPr>
       <w:r>
         <w:rPr>
-          <w:rFonts w:ascii="Calibri" w:hAnsi="Calibri" w:cs="Calibri"/>
+          <w:rFonts w:ascii="Avenir Next" w:hAnsi="Avenir Next"/>
           <w:b/>
           <w:i w:val="0"/>
-          <w:caps/>
-          <w:color w:val="2F3C7E"/>
+          <w:color w:val="5E8A18"/>
           <w:sz w:val="32"/>
+          <w:u w:val="none"/>
+          <w:rFonts w:ascii="Avenir Next" w:hAnsi="Avenir Next" w:cs="Avenir Next"/>
         </w:rPr>
-        <w:t>Model It</w:t>
+        <w:t xml:space="preserve">V1   </w:t>
+      </w:r>
+      <w:r>
+        <w:rPr>
+          <w:rFonts w:ascii="Avenir Next" w:hAnsi="Avenir Next"/>
+          <w:b/>
+          <w:i w:val="0"/>
+          <w:color w:val="1B4FC2"/>
+          <w:sz w:val="32"/>
+          <w:u w:val="none"/>
+          <w:rFonts w:ascii="Avenir Next" w:hAnsi="Avenir Next" w:cs="Avenir Next"/>
+        </w:rPr>
+        <w:t>Vocabulary — Speed</w:t>
       </w:r>
     </w:p>
     <w:p>
       <w:pPr>
-        <w:spacing w:before="0" w:after="30"/>
+        <w:spacing w:before="0" w:after="40"/>
       </w:pPr>
       <w:r>
         <w:rPr>
-          <w:rFonts w:ascii="Calibri" w:hAnsi="Calibri" w:cs="Calibri"/>
+          <w:rFonts w:ascii="Avenir Next" w:hAnsi="Avenir Next"/>
           <w:b w:val="0"/>
           <w:i/>
-          <w:color w:val="555555"/>
+          <w:color w:val="4A5268"/>
           <w:sz w:val="24"/>
+          <w:u w:val="none"/>
+          <w:rFonts w:ascii="Avenir Next" w:hAnsi="Avenir Next" w:cs="Avenir Next"/>
         </w:rPr>
-        <w:t>We compare the SAME object moving faster and slower. A greater change is evidence of more energy of motion.</w:t>
+        <w:t>Reader p. 13</w:t>
       </w:r>
+    </w:p>
+    <w:p>
+      <w:pPr>
+        <w:spacing w:before="0" w:after="120" w:line="520" w:lineRule="exact"/>
+      </w:pPr>
+      <w:r>
+        <w:rPr>
+          <w:rFonts w:ascii="Avenir Next" w:hAnsi="Avenir Next"/>
+          <w:b w:val="0"/>
+          <w:i w:val="0"/>
+          <w:color w:val="1A1D26"/>
+          <w:sz w:val="28"/>
+          <w:u w:val="none"/>
+          <w:rFonts w:ascii="Avenir Next" w:hAnsi="Avenir Next" w:cs="Avenir Next"/>
+        </w:rPr>
+        <w:t xml:space="preserve">speed — a measurement of the </w:t>
+      </w:r>
+      <w:r>
+        <w:rPr>
+          <w:rFonts w:ascii="Avenir Next" w:hAnsi="Avenir Next"/>
+          <w:b w:val="0"/>
+          <w:i w:val="0"/>
+          <w:color w:val="1A1D26"/>
+          <w:sz w:val="28"/>
+          <w:u w:val="single"/>
+          <w:rFonts w:ascii="Avenir Next" w:hAnsi="Avenir Next" w:cs="Avenir Next"/>
+        </w:rPr>
+        <w:t>________________</w:t>
+      </w:r>
+      <w:r>
+        <w:rPr>
+          <w:rFonts w:ascii="Avenir Next" w:hAnsi="Avenir Next"/>
+          <w:b w:val="0"/>
+          <w:i w:val="0"/>
+          <w:color w:val="1A1D26"/>
+          <w:sz w:val="28"/>
+          <w:u w:val="none"/>
+          <w:rFonts w:ascii="Avenir Next" w:hAnsi="Avenir Next" w:cs="Avenir Next"/>
+        </w:rPr>
+        <w:t xml:space="preserve"> an object travels over an amount of time.</w:t>
+      </w:r>
+    </w:p>
+    <w:p>
+      <w:pPr>
+        <w:spacing w:before="160" w:after="40"/>
+        <w:pBdr>
+          <w:bottom w:val="single" w:sz="10" w:color="1B4FC2"/>
+        </w:pBdr>
+      </w:pPr>
+      <w:r>
+        <w:rPr>
+          <w:rFonts w:ascii="Avenir Next" w:hAnsi="Avenir Next"/>
+          <w:b/>
+          <w:i w:val="0"/>
+          <w:color w:val="5E8A18"/>
+          <w:sz w:val="32"/>
+          <w:u w:val="none"/>
+          <w:rFonts w:ascii="Avenir Next" w:hAnsi="Avenir Next" w:cs="Avenir Next"/>
+        </w:rPr>
+        <w:t xml:space="preserve">N1   </w:t>
+      </w:r>
+      <w:r>
+        <w:rPr>
+          <w:rFonts w:ascii="Avenir Next" w:hAnsi="Avenir Next"/>
+          <w:b/>
+          <w:i w:val="0"/>
+          <w:color w:val="1B4FC2"/>
+          <w:sz w:val="32"/>
+          <w:u w:val="none"/>
+          <w:rFonts w:ascii="Avenir Next" w:hAnsi="Avenir Next" w:cs="Avenir Next"/>
+        </w:rPr>
+        <w:t>One Ball, Two Speeds</w:t>
+      </w:r>
+    </w:p>
+    <w:p>
+      <w:pPr>
+        <w:spacing w:before="0" w:after="40"/>
+      </w:pPr>
+      <w:r>
+        <w:rPr>
+          <w:rFonts w:ascii="Avenir Next" w:hAnsi="Avenir Next"/>
+          <w:b w:val="0"/>
+          <w:i/>
+          <w:color w:val="4A5268"/>
+          <w:sz w:val="24"/>
+          <w:u w:val="none"/>
+          <w:rFonts w:ascii="Avenir Next" w:hAnsi="Avenir Next" w:cs="Avenir Next"/>
+        </w:rPr>
+        <w:t>Reader p. 13-14</w:t>
+      </w:r>
+    </w:p>
+    <w:p>
+      <w:pPr>
+        <w:spacing w:before="0" w:after="120" w:line="520" w:lineRule="exact"/>
+      </w:pPr>
+      <w:r>
+        <w:rPr>
+          <w:rFonts w:ascii="Avenir Next" w:hAnsi="Avenir Next"/>
+          <w:b w:val="0"/>
+          <w:i w:val="0"/>
+          <w:color w:val="1A1D26"/>
+          <w:sz w:val="28"/>
+          <w:u w:val="none"/>
+          <w:rFonts w:ascii="Avenir Next" w:hAnsi="Avenir Next" w:cs="Avenir Next"/>
+        </w:rPr>
+        <w:t xml:space="preserve">Compare the </w:t>
+      </w:r>
+      <w:r>
+        <w:rPr>
+          <w:rFonts w:ascii="Avenir Next" w:hAnsi="Avenir Next"/>
+          <w:b w:val="0"/>
+          <w:i w:val="0"/>
+          <w:color w:val="1A1D26"/>
+          <w:sz w:val="28"/>
+          <w:u w:val="single"/>
+          <w:rFonts w:ascii="Avenir Next" w:hAnsi="Avenir Next" w:cs="Avenir Next"/>
+        </w:rPr>
+        <w:t>________________</w:t>
+      </w:r>
+      <w:r>
+        <w:rPr>
+          <w:rFonts w:ascii="Avenir Next" w:hAnsi="Avenir Next"/>
+          <w:b w:val="0"/>
+          <w:i w:val="0"/>
+          <w:color w:val="1A1D26"/>
+          <w:sz w:val="28"/>
+          <w:u w:val="none"/>
+          <w:rFonts w:ascii="Avenir Next" w:hAnsi="Avenir Next" w:cs="Avenir Next"/>
+        </w:rPr>
+        <w:t xml:space="preserve"> ball at two speeds.</w:t>
+      </w:r>
+    </w:p>
+    <w:p>
+      <w:pPr>
+        <w:spacing w:before="0" w:after="120" w:line="520" w:lineRule="exact"/>
+      </w:pPr>
+      <w:r>
+        <w:rPr>
+          <w:rFonts w:ascii="Avenir Next" w:hAnsi="Avenir Next"/>
+          <w:b w:val="0"/>
+          <w:i w:val="0"/>
+          <w:color w:val="1A1D26"/>
+          <w:sz w:val="28"/>
+          <w:u w:val="none"/>
+          <w:rFonts w:ascii="Avenir Next" w:hAnsi="Avenir Next" w:cs="Avenir Next"/>
+        </w:rPr>
+        <w:t xml:space="preserve">A bigger </w:t>
+      </w:r>
+      <w:r>
+        <w:rPr>
+          <w:rFonts w:ascii="Avenir Next" w:hAnsi="Avenir Next"/>
+          <w:b w:val="0"/>
+          <w:i w:val="0"/>
+          <w:color w:val="1A1D26"/>
+          <w:sz w:val="28"/>
+          <w:u w:val="single"/>
+          <w:rFonts w:ascii="Avenir Next" w:hAnsi="Avenir Next" w:cs="Avenir Next"/>
+        </w:rPr>
+        <w:t>________________</w:t>
+      </w:r>
+      <w:r>
+        <w:rPr>
+          <w:rFonts w:ascii="Avenir Next" w:hAnsi="Avenir Next"/>
+          <w:b w:val="0"/>
+          <w:i w:val="0"/>
+          <w:color w:val="1A1D26"/>
+          <w:sz w:val="28"/>
+          <w:u w:val="none"/>
+          <w:rFonts w:ascii="Avenir Next" w:hAnsi="Avenir Next" w:cs="Avenir Next"/>
+        </w:rPr>
+        <w:t xml:space="preserve"> is how we know the faster ball had more energy of motion.</w:t>
+      </w:r>
+    </w:p>
+    <w:p>
+      <w:pPr>
+        <w:spacing w:before="0" w:after="80"/>
+      </w:pPr>
     </w:p>
     <w:tbl>
       <w:tblPr>
         <w:tblW w:type="auto" w:w="0"/>
         <w:tblLook w:firstColumn="1" w:firstRow="1" w:lastColumn="0" w:lastRow="0" w:noHBand="0" w:noVBand="1" w:val="04A0"/>
         <w:tblBorders>
-          <w:top w:val="none" w:sz="0" w:space="0" w:color="FFFFFF"/>
-          <w:left w:val="none" w:sz="0" w:space="0" w:color="FFFFFF"/>
-          <w:bottom w:val="none" w:sz="0" w:space="0" w:color="FFFFFF"/>
-          <w:right w:val="none" w:sz="0" w:space="0" w:color="FFFFFF"/>
-          <w:insideH w:val="none" w:sz="0" w:space="0" w:color="FFFFFF"/>
-          <w:insideV w:val="none" w:sz="0" w:space="0" w:color="FFFFFF"/>
+          <w:top w:val="none"/>
+          <w:left w:val="none"/>
+          <w:bottom w:val="none"/>
+          <w:right w:val="none"/>
+          <w:insideH w:val="none"/>
+          <w:insideV w:val="none"/>
         </w:tblBorders>
       </w:tblPr>
       <w:tblGrid>
-        <w:gridCol w:w="2016"/>
-        <w:gridCol w:w="2016"/>
-        <w:gridCol w:w="2016"/>
-        <w:gridCol w:w="2016"/>
-        <w:gridCol w:w="2016"/>
+        <w:gridCol w:w="2131"/>
+        <w:gridCol w:w="2131"/>
+        <w:gridCol w:w="2131"/>
+        <w:gridCol w:w="2131"/>
+        <w:gridCol w:w="2131"/>
       </w:tblGrid>
       <w:tr>
+        <w:trPr>
+          <w:trHeight w:val="520" w:hRule="exact"/>
+        </w:trPr>
         <w:tc>
           <w:tcPr>
-            <w:tcW w:type="dxa" w:w="2060"/>
+            <w:tcW w:type="dxa" w:w="2131"/>
+            <w:shd w:val="clear" w:color="auto" w:fill="1B4FC2"/>
             <w:tcMar>
               <w:top w:w="40" w:type="dxa"/>
-              <w:left w:w="8" w:type="dxa"/>
+              <w:left w:w="40" w:type="dxa"/>
               <w:bottom w:w="40" w:type="dxa"/>
-              <w:right w:w="8" w:type="dxa"/>
-            </w:tcMar>
-            <w:vAlign w:val="center"/>
-            <w:shd w:fill="2F3C7E"/>
-          </w:tcPr>
-          <w:p>
-            <w:pPr>
-              <w:jc w:val="center"/>
-            </w:pPr>
-            <w:r>
-              <w:rPr>
-                <w:rFonts w:ascii="Calibri" w:hAnsi="Calibri" w:cs="Calibri"/>
-                <w:b/>
-                <w:i w:val="0"/>
-                <w:color w:val="FFFFFF"/>
-                <w:sz w:val="24"/>
-              </w:rPr>
-              <w:t>SAME OBJECT · FASTER</w:t>
-            </w:r>
-          </w:p>
-        </w:tc>
-        <w:tc>
-          <w:tcPr>
-            <w:tcW w:type="dxa" w:w="520"/>
-            <w:tcMar>
-              <w:top w:w="40" w:type="dxa"/>
-              <w:left w:w="8" w:type="dxa"/>
-              <w:bottom w:w="40" w:type="dxa"/>
-              <w:right w:w="8" w:type="dxa"/>
+              <w:right w:w="40" w:type="dxa"/>
             </w:tcMar>
             <w:vAlign w:val="center"/>
           </w:tcPr>
@@ -362,11 +529,36 @@
             </w:pPr>
             <w:r>
               <w:rPr>
-                <w:rFonts w:ascii="Calibri" w:hAnsi="Calibri" w:cs="Calibri"/>
+                <w:rFonts w:ascii="Avenir Next" w:hAnsi="Avenir Next"/>
                 <w:b/>
                 <w:i w:val="0"/>
-                <w:color w:val="C03D3D"/>
-                <w:sz w:val="28"/>
+                <w:color w:val="FFFFFF"/>
+                <w:sz w:val="24"/>
+                <w:u w:val="none"/>
+                <w:rFonts w:ascii="Avenir Next" w:hAnsi="Avenir Next" w:cs="Avenir Next"/>
+              </w:rPr>
+              <w:t>BALL</w:t>
+            </w:r>
+          </w:p>
+        </w:tc>
+        <w:tc>
+          <w:tcPr>
+            <w:tcW w:type="dxa" w:w="2131"/>
+            <w:vAlign w:val="center"/>
+          </w:tcPr>
+          <w:p>
+            <w:pPr>
+              <w:jc w:val="center"/>
+            </w:pPr>
+            <w:r>
+              <w:rPr>
+                <w:rFonts w:ascii="Avenir Next" w:hAnsi="Avenir Next"/>
+                <w:b/>
+                <w:i w:val="0"/>
+                <w:color w:val="5E8A18"/>
+                <w:sz w:val="32"/>
+                <w:u w:val="none"/>
+                <w:rFonts w:ascii="Avenir Next" w:hAnsi="Avenir Next" w:cs="Avenir Next"/>
               </w:rPr>
               <w:t>→</w:t>
             </w:r>
@@ -374,40 +566,13 @@
         </w:tc>
         <w:tc>
           <w:tcPr>
-            <w:tcW w:type="dxa" w:w="2060"/>
+            <w:tcW w:type="dxa" w:w="2131"/>
+            <w:shd w:val="clear" w:color="auto" w:fill="2B2F36"/>
             <w:tcMar>
               <w:top w:w="40" w:type="dxa"/>
-              <w:left w:w="8" w:type="dxa"/>
+              <w:left w:w="40" w:type="dxa"/>
               <w:bottom w:w="40" w:type="dxa"/>
-              <w:right w:w="8" w:type="dxa"/>
-            </w:tcMar>
-            <w:vAlign w:val="center"/>
-            <w:shd w:fill="2F3C7E"/>
-          </w:tcPr>
-          <w:p>
-            <w:pPr>
-              <w:jc w:val="center"/>
-            </w:pPr>
-            <w:r>
-              <w:rPr>
-                <w:rFonts w:ascii="Calibri" w:hAnsi="Calibri" w:cs="Calibri"/>
-                <w:b/>
-                <w:i w:val="0"/>
-                <w:color w:val="FFFFFF"/>
-                <w:sz w:val="24"/>
-              </w:rPr>
-              <w:t>GREATER CHANGE</w:t>
-            </w:r>
-          </w:p>
-        </w:tc>
-        <w:tc>
-          <w:tcPr>
-            <w:tcW w:type="dxa" w:w="520"/>
-            <w:tcMar>
-              <w:top w:w="40" w:type="dxa"/>
-              <w:left w:w="8" w:type="dxa"/>
-              <w:bottom w:w="40" w:type="dxa"/>
-              <w:right w:w="8" w:type="dxa"/>
+              <w:right w:w="40" w:type="dxa"/>
             </w:tcMar>
             <w:vAlign w:val="center"/>
           </w:tcPr>
@@ -417,11 +582,36 @@
             </w:pPr>
             <w:r>
               <w:rPr>
-                <w:rFonts w:ascii="Calibri" w:hAnsi="Calibri" w:cs="Calibri"/>
+                <w:rFonts w:ascii="Avenir Next" w:hAnsi="Avenir Next"/>
                 <w:b/>
                 <w:i w:val="0"/>
-                <w:color w:val="C03D3D"/>
-                <w:sz w:val="28"/>
+                <w:color w:val="FFFFFF"/>
+                <w:sz w:val="24"/>
+                <w:u w:val="none"/>
+                <w:rFonts w:ascii="Avenir Next" w:hAnsi="Avenir Next" w:cs="Avenir Next"/>
+              </w:rPr>
+              <w:t>OBSERVE</w:t>
+            </w:r>
+          </w:p>
+        </w:tc>
+        <w:tc>
+          <w:tcPr>
+            <w:tcW w:type="dxa" w:w="2131"/>
+            <w:vAlign w:val="center"/>
+          </w:tcPr>
+          <w:p>
+            <w:pPr>
+              <w:jc w:val="center"/>
+            </w:pPr>
+            <w:r>
+              <w:rPr>
+                <w:rFonts w:ascii="Avenir Next" w:hAnsi="Avenir Next"/>
+                <w:b/>
+                <w:i w:val="0"/>
+                <w:color w:val="5E8A18"/>
+                <w:sz w:val="32"/>
+                <w:u w:val="none"/>
+                <w:rFonts w:ascii="Avenir Next" w:hAnsi="Avenir Next" w:cs="Avenir Next"/>
               </w:rPr>
               <w:t>→</w:t>
             </w:r>
@@ -429,15 +619,15 @@
         </w:tc>
         <w:tc>
           <w:tcPr>
-            <w:tcW w:type="dxa" w:w="2060"/>
+            <w:tcW w:type="dxa" w:w="2131"/>
+            <w:shd w:val="clear" w:color="auto" w:fill="1B4FC2"/>
             <w:tcMar>
               <w:top w:w="40" w:type="dxa"/>
-              <w:left w:w="8" w:type="dxa"/>
+              <w:left w:w="40" w:type="dxa"/>
               <w:bottom w:w="40" w:type="dxa"/>
-              <w:right w:w="8" w:type="dxa"/>
+              <w:right w:w="40" w:type="dxa"/>
             </w:tcMar>
             <w:vAlign w:val="center"/>
-            <w:shd w:fill="2F3C7E"/>
           </w:tcPr>
           <w:p>
             <w:pPr>
@@ -445,13 +635,15 @@
             </w:pPr>
             <w:r>
               <w:rPr>
-                <w:rFonts w:ascii="Calibri" w:hAnsi="Calibri" w:cs="Calibri"/>
+                <w:rFonts w:ascii="Avenir Next" w:hAnsi="Avenir Next"/>
                 <w:b/>
                 <w:i w:val="0"/>
                 <w:color w:val="FFFFFF"/>
                 <w:sz w:val="24"/>
+                <w:u w:val="none"/>
+                <w:rFonts w:ascii="Avenir Next" w:hAnsi="Avenir Next" w:cs="Avenir Next"/>
               </w:rPr>
-              <w:t>MORE ENERGY OF MOTION</w:t>
+              <w:t>EVIDENCE</w:t>
             </w:r>
           </w:p>
         </w:tc>
@@ -459,38 +651,19 @@
     </w:tbl>
     <w:p>
       <w:pPr>
-        <w:spacing w:after="40"/>
-      </w:pPr>
-    </w:p>
-    <w:p>
-      <w:pPr>
-        <w:spacing w:before="100" w:after="40"/>
+        <w:spacing w:before="120" w:after="80"/>
       </w:pPr>
       <w:r>
         <w:rPr>
-          <w:rFonts w:ascii="Calibri" w:hAnsi="Calibri" w:cs="Calibri"/>
-          <w:b/>
-          <w:i w:val="0"/>
-          <w:caps/>
-          <w:color w:val="2F3C7E"/>
-          <w:sz w:val="32"/>
+          <w:rFonts w:ascii="Avenir Next" w:hAnsi="Avenir Next"/>
+          <w:b w:val="0"/>
+          <w:i/>
+          <w:color w:val="4A5268"/>
+          <w:sz w:val="24"/>
+          <w:u w:val="none"/>
+          <w:rFonts w:ascii="Avenir Next" w:hAnsi="Avenir Next" w:cs="Avenir Next"/>
         </w:rPr>
-        <w:t>Draw / Label</w:t>
-      </w:r>
-    </w:p>
-    <w:p>
-      <w:pPr>
-        <w:spacing w:before="0" w:after="20"/>
-      </w:pPr>
-      <w:r>
-        <w:rPr>
-          <w:rFonts w:ascii="Calibri" w:hAnsi="Calibri" w:cs="Calibri"/>
-          <w:b w:val="0"/>
-          <w:i w:val="0"/>
-          <w:color w:val="555555"/>
-          <w:sz w:val="24"/>
-        </w:rPr>
-        <w:t>Draw the same ball at a LOW ramp and a HIGH ramp. Show which rolls away faster.</w:t>
+        <w:t>Preview: one ball, two setups. Which cup move was bigger?</w:t>
       </w:r>
     </w:p>
     <w:tbl>
@@ -498,85 +671,422 @@
         <w:tblW w:type="auto" w:w="0"/>
         <w:tblLook w:firstColumn="1" w:firstRow="1" w:lastColumn="0" w:lastRow="0" w:noHBand="0" w:noVBand="1" w:val="04A0"/>
         <w:tblBorders>
-          <w:top w:val="none" w:sz="0" w:space="0" w:color="FFFFFF"/>
-          <w:left w:val="none" w:sz="0" w:space="0" w:color="FFFFFF"/>
-          <w:bottom w:val="none" w:sz="0" w:space="0" w:color="FFFFFF"/>
-          <w:right w:val="none" w:sz="0" w:space="0" w:color="FFFFFF"/>
-          <w:insideH w:val="none" w:sz="0" w:space="0" w:color="FFFFFF"/>
-          <w:insideV w:val="none" w:sz="0" w:space="0" w:color="FFFFFF"/>
+          <w:top w:val="none"/>
+          <w:left w:val="none"/>
+          <w:bottom w:val="none"/>
+          <w:right w:val="none"/>
+          <w:insideH w:val="none"/>
+          <w:insideV w:val="none"/>
         </w:tblBorders>
       </w:tblPr>
       <w:tblGrid>
-        <w:gridCol w:w="5040"/>
-        <w:gridCol w:w="5040"/>
+        <w:gridCol w:w="10656"/>
       </w:tblGrid>
       <w:tr>
         <w:trPr>
-          <w:trHeight w:val="1600" w:hRule="exact"/>
+          <w:trHeight w:val="560" w:hRule="exact"/>
         </w:trPr>
         <w:tc>
           <w:tcPr>
-            <w:tcW w:type="dxa" w:w="4980"/>
+            <w:tcW w:type="dxa" w:w="10656"/>
             <w:tcMar>
-              <w:top w:w="20" w:type="dxa"/>
-              <w:left w:w="60" w:type="dxa"/>
-              <w:bottom w:w="20" w:type="dxa"/>
-              <w:right w:w="60" w:type="dxa"/>
+              <w:top w:w="0" w:type="dxa"/>
+              <w:left w:w="0" w:type="dxa"/>
+              <w:bottom w:w="0" w:type="dxa"/>
+              <w:right w:w="0" w:type="dxa"/>
             </w:tcMar>
             <w:tcBorders>
-              <w:top w:sz="8" w:val="single" w:color="2F3C7E"/>
-              <w:left w:sz="8" w:val="single" w:color="2F3C7E"/>
-              <w:bottom w:sz="8" w:val="single" w:color="2F3C7E"/>
-              <w:right w:sz="8" w:val="single" w:color="2F3C7E"/>
+              <w:bottom w:val="single" w:sz="8" w:color="1A1D26"/>
             </w:tcBorders>
           </w:tcPr>
           <w:p>
             <w:pPr>
-              <w:jc w:val="center"/>
+              <w:spacing w:before="0" w:after="0" w:line="40" w:lineRule="exact"/>
             </w:pPr>
             <w:r>
               <w:rPr>
-                <w:rFonts w:ascii="Calibri" w:hAnsi="Calibri" w:cs="Calibri"/>
-                <w:b/>
+                <w:rFonts w:ascii="Avenir Next" w:hAnsi="Avenir Next"/>
+                <w:b w:val="0"/>
                 <w:i w:val="0"/>
-                <w:caps/>
-                <w:color w:val="C03D3D"/>
-                <w:sz w:val="26"/>
+                <w:color w:val="1A1D26"/>
+                <w:sz w:val="4"/>
+                <w:u w:val="none"/>
+                <w:rFonts w:ascii="Avenir Next" w:hAnsi="Avenir Next" w:cs="Avenir Next"/>
               </w:rPr>
-              <w:t>LOW RAMP (slower)</w:t>
             </w:r>
           </w:p>
         </w:tc>
+      </w:tr>
+      <w:tr>
+        <w:trPr>
+          <w:trHeight w:val="560" w:hRule="exact"/>
+        </w:trPr>
         <w:tc>
           <w:tcPr>
-            <w:tcW w:type="dxa" w:w="4980"/>
+            <w:tcW w:type="dxa" w:w="10656"/>
             <w:tcMar>
-              <w:top w:w="20" w:type="dxa"/>
-              <w:left w:w="60" w:type="dxa"/>
-              <w:bottom w:w="20" w:type="dxa"/>
-              <w:right w:w="60" w:type="dxa"/>
+              <w:top w:w="0" w:type="dxa"/>
+              <w:left w:w="0" w:type="dxa"/>
+              <w:bottom w:w="0" w:type="dxa"/>
+              <w:right w:w="0" w:type="dxa"/>
             </w:tcMar>
             <w:tcBorders>
-              <w:top w:sz="8" w:val="single" w:color="2F3C7E"/>
-              <w:left w:sz="8" w:val="single" w:color="2F3C7E"/>
-              <w:bottom w:sz="8" w:val="single" w:color="2F3C7E"/>
-              <w:right w:sz="8" w:val="single" w:color="2F3C7E"/>
+              <w:bottom w:val="single" w:sz="8" w:color="1A1D26"/>
             </w:tcBorders>
           </w:tcPr>
           <w:p>
             <w:pPr>
-              <w:jc w:val="center"/>
+              <w:spacing w:before="0" w:after="0" w:line="40" w:lineRule="exact"/>
             </w:pPr>
             <w:r>
               <w:rPr>
-                <w:rFonts w:ascii="Calibri" w:hAnsi="Calibri" w:cs="Calibri"/>
-                <w:b/>
+                <w:rFonts w:ascii="Avenir Next" w:hAnsi="Avenir Next"/>
+                <w:b w:val="0"/>
                 <w:i w:val="0"/>
-                <w:caps/>
-                <w:color w:val="C03D3D"/>
-                <w:sz w:val="26"/>
+                <w:color w:val="1A1D26"/>
+                <w:sz w:val="4"/>
+                <w:u w:val="none"/>
+                <w:rFonts w:ascii="Avenir Next" w:hAnsi="Avenir Next" w:cs="Avenir Next"/>
               </w:rPr>
-              <w:t>HIGH RAMP (faster)</w:t>
+            </w:r>
+          </w:p>
+        </w:tc>
+      </w:tr>
+    </w:tbl>
+    <w:p>
+      <w:r>
+        <w:br w:type="page"/>
+      </w:r>
+    </w:p>
+    <w:p>
+      <w:pPr>
+        <w:spacing w:before="160" w:after="40"/>
+        <w:pBdr>
+          <w:bottom w:val="single" w:sz="10" w:color="1B4FC2"/>
+        </w:pBdr>
+      </w:pPr>
+      <w:r>
+        <w:rPr>
+          <w:rFonts w:ascii="Avenir Next" w:hAnsi="Avenir Next"/>
+          <w:b/>
+          <w:i w:val="0"/>
+          <w:color w:val="5E8A18"/>
+          <w:sz w:val="32"/>
+          <w:u w:val="none"/>
+          <w:rFonts w:ascii="Avenir Next" w:hAnsi="Avenir Next" w:cs="Avenir Next"/>
+        </w:rPr>
+        <w:t xml:space="preserve">N2   </w:t>
+      </w:r>
+      <w:r>
+        <w:rPr>
+          <w:rFonts w:ascii="Avenir Next" w:hAnsi="Avenir Next"/>
+          <w:b/>
+          <w:i w:val="0"/>
+          <w:color w:val="1B4FC2"/>
+          <w:sz w:val="32"/>
+          <w:u w:val="none"/>
+          <w:rFonts w:ascii="Avenir Next" w:hAnsi="Avenir Next" w:cs="Avenir Next"/>
+        </w:rPr>
+        <w:t>What We Measured</w:t>
+      </w:r>
+    </w:p>
+    <w:p>
+      <w:pPr>
+        <w:spacing w:before="0" w:after="40"/>
+      </w:pPr>
+      <w:r>
+        <w:rPr>
+          <w:rFonts w:ascii="Avenir Next" w:hAnsi="Avenir Next"/>
+          <w:b w:val="0"/>
+          <w:i/>
+          <w:color w:val="4A5268"/>
+          <w:sz w:val="24"/>
+          <w:u w:val="none"/>
+          <w:rFonts w:ascii="Avenir Next" w:hAnsi="Avenir Next" w:cs="Avenir Next"/>
+        </w:rPr>
+        <w:t>Reader p. 13-14</w:t>
+      </w:r>
+    </w:p>
+    <w:p>
+      <w:pPr>
+        <w:spacing w:before="0" w:after="120" w:line="520" w:lineRule="exact"/>
+      </w:pPr>
+      <w:r>
+        <w:rPr>
+          <w:rFonts w:ascii="Avenir Next" w:hAnsi="Avenir Next"/>
+          <w:b w:val="0"/>
+          <w:i w:val="0"/>
+          <w:color w:val="1A1D26"/>
+          <w:sz w:val="28"/>
+          <w:u w:val="none"/>
+          <w:rFonts w:ascii="Avenir Next" w:hAnsi="Avenir Next" w:cs="Avenir Next"/>
+        </w:rPr>
+        <w:t xml:space="preserve">We measure ramp </w:t>
+      </w:r>
+      <w:r>
+        <w:rPr>
+          <w:rFonts w:ascii="Avenir Next" w:hAnsi="Avenir Next"/>
+          <w:b w:val="0"/>
+          <w:i w:val="0"/>
+          <w:color w:val="1A1D26"/>
+          <w:sz w:val="28"/>
+          <w:u w:val="single"/>
+          <w:rFonts w:ascii="Avenir Next" w:hAnsi="Avenir Next" w:cs="Avenir Next"/>
+        </w:rPr>
+        <w:t>________________</w:t>
+      </w:r>
+      <w:r>
+        <w:rPr>
+          <w:rFonts w:ascii="Avenir Next" w:hAnsi="Avenir Next"/>
+          <w:b w:val="0"/>
+          <w:i w:val="0"/>
+          <w:color w:val="1A1D26"/>
+          <w:sz w:val="28"/>
+          <w:u w:val="none"/>
+          <w:rFonts w:ascii="Avenir Next" w:hAnsi="Avenir Next" w:cs="Avenir Next"/>
+        </w:rPr>
+        <w:t xml:space="preserve"> in centimeters.</w:t>
+      </w:r>
+    </w:p>
+    <w:p>
+      <w:pPr>
+        <w:spacing w:before="0" w:after="120" w:line="520" w:lineRule="exact"/>
+      </w:pPr>
+      <w:r>
+        <w:rPr>
+          <w:rFonts w:ascii="Avenir Next" w:hAnsi="Avenir Next"/>
+          <w:b w:val="0"/>
+          <w:i w:val="0"/>
+          <w:color w:val="1A1D26"/>
+          <w:sz w:val="28"/>
+          <w:u w:val="none"/>
+          <w:rFonts w:ascii="Avenir Next" w:hAnsi="Avenir Next" w:cs="Avenir Next"/>
+        </w:rPr>
+        <w:t xml:space="preserve">We </w:t>
+      </w:r>
+      <w:r>
+        <w:rPr>
+          <w:rFonts w:ascii="Avenir Next" w:hAnsi="Avenir Next"/>
+          <w:b w:val="0"/>
+          <w:i w:val="0"/>
+          <w:color w:val="1A1D26"/>
+          <w:sz w:val="28"/>
+          <w:u w:val="single"/>
+          <w:rFonts w:ascii="Avenir Next" w:hAnsi="Avenir Next" w:cs="Avenir Next"/>
+        </w:rPr>
+        <w:t>________________</w:t>
+      </w:r>
+      <w:r>
+        <w:rPr>
+          <w:rFonts w:ascii="Avenir Next" w:hAnsi="Avenir Next"/>
+          <w:b w:val="0"/>
+          <w:i w:val="0"/>
+          <w:color w:val="1A1D26"/>
+          <w:sz w:val="28"/>
+          <w:u w:val="none"/>
+          <w:rFonts w:ascii="Avenir Next" w:hAnsi="Avenir Next" w:cs="Avenir Next"/>
+        </w:rPr>
+        <w:t xml:space="preserve"> the speed relationship from that change. We do not measure a speed number.</w:t>
+      </w:r>
+    </w:p>
+    <w:p>
+      <w:pPr>
+        <w:spacing w:before="0" w:after="120" w:line="520" w:lineRule="exact"/>
+      </w:pPr>
+      <w:r>
+        <w:rPr>
+          <w:rFonts w:ascii="Avenir Next" w:hAnsi="Avenir Next"/>
+          <w:b w:val="0"/>
+          <w:i w:val="0"/>
+          <w:color w:val="1A1D26"/>
+          <w:sz w:val="28"/>
+          <w:u w:val="none"/>
+          <w:rFonts w:ascii="Avenir Next" w:hAnsi="Avenir Next" w:cs="Avenir Next"/>
+        </w:rPr>
+        <w:t xml:space="preserve">The one thing we change is ramp </w:t>
+      </w:r>
+      <w:r>
+        <w:rPr>
+          <w:rFonts w:ascii="Avenir Next" w:hAnsi="Avenir Next"/>
+          <w:b w:val="0"/>
+          <w:i w:val="0"/>
+          <w:color w:val="1A1D26"/>
+          <w:sz w:val="28"/>
+          <w:u w:val="single"/>
+          <w:rFonts w:ascii="Avenir Next" w:hAnsi="Avenir Next" w:cs="Avenir Next"/>
+        </w:rPr>
+        <w:t>________________</w:t>
+      </w:r>
+      <w:r>
+        <w:rPr>
+          <w:rFonts w:ascii="Avenir Next" w:hAnsi="Avenir Next"/>
+          <w:b w:val="0"/>
+          <w:i w:val="0"/>
+          <w:color w:val="1A1D26"/>
+          <w:sz w:val="28"/>
+          <w:u w:val="none"/>
+          <w:rFonts w:ascii="Avenir Next" w:hAnsi="Avenir Next" w:cs="Avenir Next"/>
+        </w:rPr>
+        <w:t>.</w:t>
+      </w:r>
+    </w:p>
+    <w:p>
+      <w:pPr>
+        <w:spacing w:before="0" w:after="120" w:line="520" w:lineRule="exact"/>
+      </w:pPr>
+      <w:r>
+        <w:rPr>
+          <w:rFonts w:ascii="Avenir Next" w:hAnsi="Avenir Next"/>
+          <w:b w:val="0"/>
+          <w:i w:val="0"/>
+          <w:color w:val="1A1D26"/>
+          <w:sz w:val="28"/>
+          <w:u w:val="none"/>
+          <w:rFonts w:ascii="Avenir Next" w:hAnsi="Avenir Next" w:cs="Avenir Next"/>
+        </w:rPr>
+        <w:t xml:space="preserve">We keep the </w:t>
+      </w:r>
+      <w:r>
+        <w:rPr>
+          <w:rFonts w:ascii="Avenir Next" w:hAnsi="Avenir Next"/>
+          <w:b w:val="0"/>
+          <w:i w:val="0"/>
+          <w:color w:val="1A1D26"/>
+          <w:sz w:val="28"/>
+          <w:u w:val="single"/>
+          <w:rFonts w:ascii="Avenir Next" w:hAnsi="Avenir Next" w:cs="Avenir Next"/>
+        </w:rPr>
+        <w:t>________________</w:t>
+      </w:r>
+      <w:r>
+        <w:rPr>
+          <w:rFonts w:ascii="Avenir Next" w:hAnsi="Avenir Next"/>
+          <w:b w:val="0"/>
+          <w:i w:val="0"/>
+          <w:color w:val="1A1D26"/>
+          <w:sz w:val="28"/>
+          <w:u w:val="none"/>
+          <w:rFonts w:ascii="Avenir Next" w:hAnsi="Avenir Next" w:cs="Avenir Next"/>
+        </w:rPr>
+        <w:t xml:space="preserve"> ball.</w:t>
+      </w:r>
+    </w:p>
+    <w:p>
+      <w:pPr>
+        <w:spacing w:before="120" w:after="80"/>
+      </w:pPr>
+      <w:r>
+        <w:rPr>
+          <w:rFonts w:ascii="Avenir Next" w:hAnsi="Avenir Next"/>
+          <w:b w:val="0"/>
+          <w:i/>
+          <w:color w:val="4A5268"/>
+          <w:sz w:val="24"/>
+          <w:u w:val="none"/>
+          <w:rFonts w:ascii="Avenir Next" w:hAnsi="Avenir Next" w:cs="Avenir Next"/>
+        </w:rPr>
+        <w:t>Record the nine measured trials on the Ramp It Up sheet. The first roll is a calibration trial. Do not record it.</w:t>
+      </w:r>
+    </w:p>
+    <w:p>
+      <w:pPr>
+        <w:spacing w:before="160" w:after="40"/>
+      </w:pPr>
+      <w:r>
+        <w:rPr>
+          <w:rFonts w:ascii="Avenir Next" w:hAnsi="Avenir Next"/>
+          <w:b/>
+          <w:i w:val="0"/>
+          <w:color w:val="1B4FC2"/>
+          <w:sz w:val="29"/>
+          <w:u w:val="none"/>
+          <w:rFonts w:ascii="Avenir Next" w:hAnsi="Avenir Next" w:cs="Avenir Next"/>
+        </w:rPr>
+        <w:t>Which setup do you predict will move the cup farther? Why?</w:t>
+      </w:r>
+    </w:p>
+    <w:tbl>
+      <w:tblPr>
+        <w:tblW w:type="auto" w:w="0"/>
+        <w:tblLook w:firstColumn="1" w:firstRow="1" w:lastColumn="0" w:lastRow="0" w:noHBand="0" w:noVBand="1" w:val="04A0"/>
+        <w:tblBorders>
+          <w:top w:val="none"/>
+          <w:left w:val="none"/>
+          <w:bottom w:val="none"/>
+          <w:right w:val="none"/>
+          <w:insideH w:val="none"/>
+          <w:insideV w:val="none"/>
+        </w:tblBorders>
+      </w:tblPr>
+      <w:tblGrid>
+        <w:gridCol w:w="10656"/>
+      </w:tblGrid>
+      <w:tr>
+        <w:trPr>
+          <w:trHeight w:val="560" w:hRule="exact"/>
+        </w:trPr>
+        <w:tc>
+          <w:tcPr>
+            <w:tcW w:type="dxa" w:w="10656"/>
+            <w:tcMar>
+              <w:top w:w="0" w:type="dxa"/>
+              <w:left w:w="0" w:type="dxa"/>
+              <w:bottom w:w="0" w:type="dxa"/>
+              <w:right w:w="0" w:type="dxa"/>
+            </w:tcMar>
+            <w:tcBorders>
+              <w:bottom w:val="single" w:sz="8" w:color="1A1D26"/>
+            </w:tcBorders>
+          </w:tcPr>
+          <w:p>
+            <w:pPr>
+              <w:spacing w:before="0" w:after="0" w:line="40" w:lineRule="exact"/>
+            </w:pPr>
+            <w:r>
+              <w:rPr>
+                <w:rFonts w:ascii="Avenir Next" w:hAnsi="Avenir Next"/>
+                <w:b w:val="0"/>
+                <w:i w:val="0"/>
+                <w:color w:val="1A1D26"/>
+                <w:sz w:val="4"/>
+                <w:u w:val="none"/>
+                <w:rFonts w:ascii="Avenir Next" w:hAnsi="Avenir Next" w:cs="Avenir Next"/>
+              </w:rPr>
+            </w:r>
+          </w:p>
+        </w:tc>
+      </w:tr>
+      <w:tr>
+        <w:trPr>
+          <w:trHeight w:val="560" w:hRule="exact"/>
+        </w:trPr>
+        <w:tc>
+          <w:tcPr>
+            <w:tcW w:type="dxa" w:w="10656"/>
+            <w:tcMar>
+              <w:top w:w="0" w:type="dxa"/>
+              <w:left w:w="0" w:type="dxa"/>
+              <w:bottom w:w="0" w:type="dxa"/>
+              <w:right w:w="0" w:type="dxa"/>
+            </w:tcMar>
+            <w:tcBorders>
+              <w:bottom w:val="single" w:sz="8" w:color="1A1D26"/>
+            </w:tcBorders>
+          </w:tcPr>
+          <w:p>
+            <w:pPr>
+              <w:spacing w:before="0" w:after="0" w:line="40" w:lineRule="exact"/>
+            </w:pPr>
+            <w:r>
+              <w:rPr>
+                <w:rFonts w:ascii="Avenir Next" w:hAnsi="Avenir Next"/>
+                <w:b w:val="0"/>
+                <w:i w:val="0"/>
+                <w:color w:val="1A1D26"/>
+                <w:sz w:val="4"/>
+                <w:u w:val="none"/>
+                <w:rFonts w:ascii="Avenir Next" w:hAnsi="Avenir Next" w:cs="Avenir Next"/>
+              </w:rPr>
             </w:r>
           </w:p>
         </w:tc>
@@ -584,137 +1094,19 @@
     </w:tbl>
     <w:p>
       <w:pPr>
-        <w:spacing w:after="60"/>
+        <w:spacing w:before="160" w:after="40"/>
       </w:pPr>
       <w:r>
         <w:rPr>
-          <w:rFonts w:ascii="Calibri" w:hAnsi="Calibri" w:cs="Calibri"/>
-          <w:b w:val="0"/>
-          <w:i w:val="0"/>
-          <w:color w:val="1F1F1F"/>
-          <w:sz w:val="24"/>
-        </w:rPr>
-        <w:t xml:space="preserve">Which one caused a greater change? How do you know? </w:t>
-      </w:r>
-      <w:r>
-        <w:rPr>
-          <w:rFonts w:ascii="Calibri" w:hAnsi="Calibri" w:cs="Calibri"/>
-          <w:b w:val="0"/>
-          <w:i w:val="0"/>
-          <w:color w:val="1F1F1F"/>
-          <w:sz w:val="24"/>
-          <w:u w:val="single"/>
-        </w:rPr>
-        <w:t>________________</w:t>
-      </w:r>
-    </w:p>
-    <w:p>
-      <w:pPr>
-        <w:pageBreakBefore/>
-        <w:jc w:val="center"/>
-      </w:pPr>
-      <w:r>
-        <w:rPr>
-          <w:rFonts w:ascii="Cambria" w:hAnsi="Cambria" w:cs="Cambria"/>
+          <w:rFonts w:ascii="Avenir Next" w:hAnsi="Avenir Next"/>
           <w:b/>
           <w:i w:val="0"/>
-          <w:color w:val="2F3C7E"/>
-          <w:sz w:val="46"/>
+          <w:color w:val="1B4FC2"/>
+          <w:sz w:val="29"/>
+          <w:u w:val="none"/>
+          <w:rFonts w:ascii="Avenir Next" w:hAnsi="Avenir Next" w:cs="Avenir Next"/>
         </w:rPr>
-        <w:t>Measured vs Inferred</w:t>
-      </w:r>
-    </w:p>
-    <w:p>
-      <w:pPr>
-        <w:jc w:val="center"/>
-      </w:pPr>
-      <w:r>
-        <w:rPr>
-          <w:rFonts w:ascii="Calibri" w:hAnsi="Calibri" w:cs="Calibri"/>
-          <w:b w:val="0"/>
-          <w:i/>
-          <w:color w:val="555555"/>
-          <w:sz w:val="24"/>
-        </w:rPr>
-        <w:t>Chapter 3 Guided Notes · Page 2</w:t>
-      </w:r>
-    </w:p>
-    <w:p>
-      <w:pPr>
-        <w:spacing w:after="40"/>
-      </w:pPr>
-      <w:r>
-        <w:rPr>
-          <w:rFonts w:ascii="Calibri" w:hAnsi="Calibri" w:cs="Calibri"/>
-          <w:b/>
-          <w:i w:val="0"/>
-          <w:color w:val="1F1F1F"/>
-          <w:sz w:val="24"/>
-        </w:rPr>
-        <w:t xml:space="preserve">Name: </w:t>
-      </w:r>
-      <w:r>
-        <w:rPr>
-          <w:rFonts w:ascii="Calibri" w:hAnsi="Calibri" w:cs="Calibri"/>
-          <w:b w:val="0"/>
-          <w:i w:val="0"/>
-          <w:color w:val="1F1F1F"/>
-          <w:sz w:val="24"/>
-          <w:u w:val="single"/>
-        </w:rPr>
-        <w:t>____________________________</w:t>
-      </w:r>
-      <w:r>
-        <w:rPr>
-          <w:rFonts w:ascii="Calibri" w:hAnsi="Calibri" w:cs="Calibri"/>
-          <w:b/>
-          <w:i w:val="0"/>
-          <w:color w:val="1F1F1F"/>
-          <w:sz w:val="24"/>
-        </w:rPr>
-        <w:t xml:space="preserve">      Date: </w:t>
-      </w:r>
-      <w:r>
-        <w:rPr>
-          <w:rFonts w:ascii="Calibri" w:hAnsi="Calibri" w:cs="Calibri"/>
-          <w:b w:val="0"/>
-          <w:i w:val="0"/>
-          <w:color w:val="1F1F1F"/>
-          <w:sz w:val="24"/>
-          <w:u w:val="single"/>
-        </w:rPr>
-        <w:t>________________</w:t>
-      </w:r>
-    </w:p>
-    <w:p>
-      <w:pPr>
-        <w:spacing w:before="100" w:after="40"/>
-      </w:pPr>
-      <w:r>
-        <w:rPr>
-          <w:rFonts w:ascii="Calibri" w:hAnsi="Calibri" w:cs="Calibri"/>
-          <w:b/>
-          <w:i w:val="0"/>
-          <w:caps/>
-          <w:color w:val="2F3C7E"/>
-          <w:sz w:val="32"/>
-        </w:rPr>
-        <w:t>Measured vs Inferred</w:t>
-      </w:r>
-    </w:p>
-    <w:p>
-      <w:pPr>
-        <w:spacing w:before="0" w:after="20"/>
-      </w:pPr>
-      <w:r>
-        <w:rPr>
-          <w:rFonts w:ascii="Calibri" w:hAnsi="Calibri" w:cs="Calibri"/>
-          <w:b w:val="0"/>
-          <w:i w:val="0"/>
-          <w:color w:val="555555"/>
-          <w:sz w:val="24"/>
-        </w:rPr>
-        <w:t>We do NOT directly measure speed or energy. We measure the change and infer the relationship.</w:t>
+        <w:t>What change did you measure?</w:t>
       </w:r>
     </w:p>
     <w:tbl>
@@ -722,339 +1114,337 @@
         <w:tblW w:type="auto" w:w="0"/>
         <w:tblLook w:firstColumn="1" w:firstRow="1" w:lastColumn="0" w:lastRow="0" w:noHBand="0" w:noVBand="1" w:val="04A0"/>
         <w:tblBorders>
-          <w:top w:val="none" w:sz="0" w:space="0" w:color="FFFFFF"/>
-          <w:left w:val="none" w:sz="0" w:space="0" w:color="FFFFFF"/>
-          <w:bottom w:val="none" w:sz="0" w:space="0" w:color="FFFFFF"/>
-          <w:right w:val="none" w:sz="0" w:space="0" w:color="FFFFFF"/>
-          <w:insideH w:val="none" w:sz="0" w:space="0" w:color="FFFFFF"/>
-          <w:insideV w:val="none" w:sz="0" w:space="0" w:color="FFFFFF"/>
+          <w:top w:val="none"/>
+          <w:left w:val="none"/>
+          <w:bottom w:val="none"/>
+          <w:right w:val="none"/>
+          <w:insideH w:val="none"/>
+          <w:insideV w:val="none"/>
         </w:tblBorders>
       </w:tblPr>
       <w:tblGrid>
-        <w:gridCol w:w="5040"/>
-        <w:gridCol w:w="5040"/>
+        <w:gridCol w:w="10656"/>
       </w:tblGrid>
       <w:tr>
         <w:trPr>
-          <w:trHeight w:val="420" w:hRule="exact"/>
+          <w:trHeight w:val="560" w:hRule="exact"/>
         </w:trPr>
         <w:tc>
           <w:tcPr>
-            <w:tcW w:type="dxa" w:w="3600"/>
+            <w:tcW w:type="dxa" w:w="10656"/>
             <w:tcMar>
-              <w:top w:w="40" w:type="dxa"/>
-              <w:left w:w="60" w:type="dxa"/>
-              <w:bottom w:w="40" w:type="dxa"/>
-              <w:right w:w="60" w:type="dxa"/>
+              <w:top w:w="0" w:type="dxa"/>
+              <w:left w:w="0" w:type="dxa"/>
+              <w:bottom w:w="0" w:type="dxa"/>
+              <w:right w:w="0" w:type="dxa"/>
             </w:tcMar>
-            <w:shd w:fill="2F3C7E"/>
+            <w:tcBorders>
+              <w:bottom w:val="single" w:sz="8" w:color="1A1D26"/>
+            </w:tcBorders>
           </w:tcPr>
           <w:p>
+            <w:pPr>
+              <w:spacing w:before="0" w:after="0" w:line="40" w:lineRule="exact"/>
+            </w:pPr>
             <w:r>
               <w:rPr>
-                <w:rFonts w:ascii="Calibri" w:hAnsi="Calibri" w:cs="Calibri"/>
-                <w:b/>
+                <w:rFonts w:ascii="Avenir Next" w:hAnsi="Avenir Next"/>
+                <w:b w:val="0"/>
                 <w:i w:val="0"/>
-                <w:caps/>
-                <w:color w:val="FFFFFF"/>
-                <w:sz w:val="24"/>
+                <w:color w:val="1A1D26"/>
+                <w:sz w:val="4"/>
+                <w:u w:val="none"/>
+                <w:rFonts w:ascii="Avenir Next" w:hAnsi="Avenir Next" w:cs="Avenir Next"/>
               </w:rPr>
-              <w:t>MEASURED (I used a tool)</w:t>
-            </w:r>
-          </w:p>
-        </w:tc>
-        <w:tc>
-          <w:tcPr>
-            <w:tcW w:type="dxa" w:w="3600"/>
-            <w:tcMar>
-              <w:top w:w="40" w:type="dxa"/>
-              <w:left w:w="60" w:type="dxa"/>
-              <w:bottom w:w="40" w:type="dxa"/>
-              <w:right w:w="60" w:type="dxa"/>
-            </w:tcMar>
-            <w:shd w:fill="2F3C7E"/>
-          </w:tcPr>
-          <w:p>
-            <w:r>
-              <w:rPr>
-                <w:rFonts w:ascii="Calibri" w:hAnsi="Calibri" w:cs="Calibri"/>
-                <w:b/>
-                <w:i w:val="0"/>
-                <w:caps/>
-                <w:color w:val="FFFFFF"/>
-                <w:sz w:val="24"/>
-              </w:rPr>
-              <w:t>INFERRED (I reasoned it)</w:t>
             </w:r>
           </w:p>
         </w:tc>
       </w:tr>
       <w:tr>
         <w:trPr>
-          <w:trHeight w:val="720" w:hRule="atLeast"/>
+          <w:trHeight w:val="560" w:hRule="exact"/>
         </w:trPr>
         <w:tc>
           <w:tcPr>
-            <w:tcW w:type="dxa" w:w="3600"/>
+            <w:tcW w:type="dxa" w:w="10656"/>
             <w:tcMar>
-              <w:top w:w="40" w:type="dxa"/>
-              <w:left w:w="60" w:type="dxa"/>
-              <w:bottom w:w="40" w:type="dxa"/>
-              <w:right w:w="60" w:type="dxa"/>
+              <w:top w:w="0" w:type="dxa"/>
+              <w:left w:w="0" w:type="dxa"/>
+              <w:bottom w:w="0" w:type="dxa"/>
+              <w:right w:w="0" w:type="dxa"/>
             </w:tcMar>
+            <w:tcBorders>
+              <w:bottom w:val="single" w:sz="8" w:color="1A1D26"/>
+            </w:tcBorders>
           </w:tcPr>
           <w:p>
             <w:pPr>
-              <w:pBdr>
-                <w:bottom w:val="single" w:sz="8" w:space="4" w:color="1F1F1F"/>
-              </w:pBdr>
+              <w:spacing w:before="0" w:after="0" w:line="40" w:lineRule="exact"/>
             </w:pPr>
             <w:r>
               <w:rPr>
-                <w:rFonts w:ascii="Calibri" w:hAnsi="Calibri" w:cs="Calibri"/>
-                <w:b/>
-                <w:i w:val="0"/>
-                <w:color w:val="2F3C7E"/>
-                <w:sz w:val="24"/>
-              </w:rPr>
-              <w:t>ramp height</w:t>
-            </w:r>
-          </w:p>
-        </w:tc>
-        <w:tc>
-          <w:tcPr>
-            <w:tcW w:type="dxa" w:w="3600"/>
-            <w:tcMar>
-              <w:top w:w="40" w:type="dxa"/>
-              <w:left w:w="60" w:type="dxa"/>
-              <w:bottom w:w="40" w:type="dxa"/>
-              <w:right w:w="60" w:type="dxa"/>
-            </w:tcMar>
-          </w:tcPr>
-          <w:p>
-            <w:pPr>
-              <w:pBdr>
-                <w:bottom w:val="single" w:sz="8" w:space="4" w:color="1F1F1F"/>
-              </w:pBdr>
-            </w:pPr>
-            <w:r>
-              <w:rPr>
-                <w:rFonts w:ascii="Calibri" w:hAnsi="Calibri" w:cs="Calibri"/>
+                <w:rFonts w:ascii="Avenir Next" w:hAnsi="Avenir Next"/>
                 <w:b w:val="0"/>
                 <w:i w:val="0"/>
-                <w:color w:val="555555"/>
-                <w:sz w:val="24"/>
+                <w:color w:val="1A1D26"/>
+                <w:sz w:val="4"/>
+                <w:u w:val="none"/>
+                <w:rFonts w:ascii="Avenir Next" w:hAnsi="Avenir Next" w:cs="Avenir Next"/>
               </w:rPr>
-              <w:t>relative speed (faster / slower)</w:t>
             </w:r>
-          </w:p>
-        </w:tc>
-      </w:tr>
-      <w:tr>
-        <w:trPr>
-          <w:trHeight w:val="720" w:hRule="atLeast"/>
-        </w:trPr>
-        <w:tc>
-          <w:tcPr>
-            <w:tcW w:type="dxa" w:w="3600"/>
-            <w:tcMar>
-              <w:top w:w="40" w:type="dxa"/>
-              <w:left w:w="60" w:type="dxa"/>
-              <w:bottom w:w="40" w:type="dxa"/>
-              <w:right w:w="60" w:type="dxa"/>
-            </w:tcMar>
-          </w:tcPr>
-          <w:p>
-            <w:pPr>
-              <w:pBdr>
-                <w:bottom w:val="single" w:sz="8" w:space="4" w:color="1F1F1F"/>
-              </w:pBdr>
-            </w:pPr>
-            <w:r>
-              <w:rPr>
-                <w:rFonts w:ascii="Calibri" w:hAnsi="Calibri" w:cs="Calibri"/>
-                <w:b/>
-                <w:i w:val="0"/>
-                <w:color w:val="2F3C7E"/>
-                <w:sz w:val="24"/>
-              </w:rPr>
-              <w:t>cup displacement (cm)</w:t>
-            </w:r>
-          </w:p>
-        </w:tc>
-        <w:tc>
-          <w:tcPr>
-            <w:tcW w:type="dxa" w:w="3600"/>
-            <w:tcMar>
-              <w:top w:w="40" w:type="dxa"/>
-              <w:left w:w="60" w:type="dxa"/>
-              <w:bottom w:w="40" w:type="dxa"/>
-              <w:right w:w="60" w:type="dxa"/>
-            </w:tcMar>
-          </w:tcPr>
-          <w:p>
-            <w:pPr>
-              <w:pBdr>
-                <w:bottom w:val="single" w:sz="8" w:space="4" w:color="1F1F1F"/>
-              </w:pBdr>
-            </w:pPr>
-            <w:r>
-              <w:rPr>
-                <w:rFonts w:ascii="Calibri" w:hAnsi="Calibri" w:cs="Calibri"/>
-                <w:b w:val="0"/>
-                <w:i w:val="0"/>
-                <w:color w:val="555555"/>
-                <w:sz w:val="24"/>
-              </w:rPr>
-              <w:t>relative energy of motion (more / less)</w:t>
-            </w:r>
-          </w:p>
-        </w:tc>
-      </w:tr>
-      <w:tr>
-        <w:trPr>
-          <w:trHeight w:val="720" w:hRule="atLeast"/>
-        </w:trPr>
-        <w:tc>
-          <w:tcPr>
-            <w:tcW w:type="dxa" w:w="3600"/>
-            <w:tcMar>
-              <w:top w:w="40" w:type="dxa"/>
-              <w:left w:w="60" w:type="dxa"/>
-              <w:bottom w:w="40" w:type="dxa"/>
-              <w:right w:w="60" w:type="dxa"/>
-            </w:tcMar>
-          </w:tcPr>
-          <w:p>
-            <w:pPr>
-              <w:pBdr>
-                <w:bottom w:val="single" w:sz="8" w:space="4" w:color="1F1F1F"/>
-              </w:pBdr>
-            </w:pPr>
-          </w:p>
-        </w:tc>
-        <w:tc>
-          <w:tcPr>
-            <w:tcW w:type="dxa" w:w="3600"/>
-            <w:tcMar>
-              <w:top w:w="40" w:type="dxa"/>
-              <w:left w:w="60" w:type="dxa"/>
-              <w:bottom w:w="40" w:type="dxa"/>
-              <w:right w:w="60" w:type="dxa"/>
-            </w:tcMar>
-          </w:tcPr>
-          <w:p>
-            <w:pPr>
-              <w:pBdr>
-                <w:bottom w:val="single" w:sz="8" w:space="4" w:color="1F1F1F"/>
-              </w:pBdr>
-            </w:pPr>
           </w:p>
         </w:tc>
       </w:tr>
     </w:tbl>
     <w:p>
-      <w:pPr>
-        <w:spacing w:after="40"/>
-      </w:pPr>
-    </w:p>
-    <w:p>
-      <w:pPr>
-        <w:spacing w:before="100" w:after="40"/>
-      </w:pPr>
       <w:r>
-        <w:rPr>
-          <w:rFonts w:ascii="Calibri" w:hAnsi="Calibri" w:cs="Calibri"/>
-          <w:b/>
-          <w:i w:val="0"/>
-          <w:caps/>
-          <w:color w:val="2F3C7E"/>
-          <w:sz w:val="32"/>
-        </w:rPr>
-        <w:t>Fair Test</w:t>
+        <w:br w:type="page"/>
       </w:r>
     </w:p>
     <w:p>
       <w:pPr>
-        <w:spacing w:before="0" w:after="20"/>
+        <w:spacing w:before="160" w:after="40"/>
+        <w:pBdr>
+          <w:bottom w:val="single" w:sz="10" w:color="1B4FC2"/>
+        </w:pBdr>
       </w:pPr>
       <w:r>
         <w:rPr>
-          <w:rFonts w:ascii="Calibri" w:hAnsi="Calibri" w:cs="Calibri"/>
-          <w:b w:val="0"/>
+          <w:rFonts w:ascii="Avenir Next" w:hAnsi="Avenir Next"/>
+          <w:b/>
           <w:i w:val="0"/>
-          <w:color w:val="555555"/>
-          <w:sz w:val="24"/>
+          <w:color w:val="5E8A18"/>
+          <w:sz w:val="32"/>
+          <w:u w:val="none"/>
+          <w:rFonts w:ascii="Avenir Next" w:hAnsi="Avenir Next" w:cs="Avenir Next"/>
         </w:rPr>
-        <w:t>A fair test changes ONE thing at a time and keeps everything else the same.</w:t>
+        <w:t xml:space="preserve">N3   </w:t>
+      </w:r>
+      <w:r>
+        <w:rPr>
+          <w:rFonts w:ascii="Avenir Next" w:hAnsi="Avenir Next"/>
+          <w:b/>
+          <w:i w:val="0"/>
+          <w:color w:val="1B4FC2"/>
+          <w:sz w:val="32"/>
+          <w:u w:val="none"/>
+          <w:rFonts w:ascii="Avenir Next" w:hAnsi="Avenir Next" w:cs="Avenir Next"/>
+        </w:rPr>
+        <w:t>Steeper Ramp</w:t>
       </w:r>
     </w:p>
     <w:p>
       <w:pPr>
-        <w:spacing w:after="60"/>
+        <w:spacing w:before="0" w:after="40"/>
       </w:pPr>
       <w:r>
         <w:rPr>
-          <w:rFonts w:ascii="Calibri" w:hAnsi="Calibri" w:cs="Calibri"/>
+          <w:rFonts w:ascii="Avenir Next" w:hAnsi="Avenir Next"/>
           <w:b w:val="0"/>
-          <w:i w:val="0"/>
-          <w:color w:val="1F1F1F"/>
-          <w:sz w:val="26"/>
+          <w:i/>
+          <w:color w:val="4A5268"/>
+          <w:sz w:val="24"/>
+          <w:u w:val="none"/>
+          <w:rFonts w:ascii="Avenir Next" w:hAnsi="Avenir Next" w:cs="Avenir Next"/>
         </w:rPr>
-        <w:t xml:space="preserve">In Ramp It Up!, the ONE thing we changed was </w:t>
-      </w:r>
-      <w:r>
-        <w:rPr>
-          <w:rFonts w:ascii="Calibri" w:hAnsi="Calibri" w:cs="Calibri"/>
-          <w:b w:val="0"/>
-          <w:i w:val="0"/>
-          <w:color w:val="1F1F1F"/>
-          <w:sz w:val="26"/>
-          <w:u w:val="single"/>
-        </w:rPr>
-        <w:t>________________</w:t>
+        <w:t>Reader p. 15</w:t>
       </w:r>
     </w:p>
     <w:p>
       <w:pPr>
-        <w:spacing w:after="60"/>
+        <w:spacing w:before="0" w:after="120" w:line="520" w:lineRule="exact"/>
       </w:pPr>
       <w:r>
         <w:rPr>
-          <w:rFonts w:ascii="Calibri" w:hAnsi="Calibri" w:cs="Calibri"/>
+          <w:rFonts w:ascii="Avenir Next" w:hAnsi="Avenir Next"/>
           <w:b w:val="0"/>
           <w:i w:val="0"/>
-          <w:color w:val="1F1F1F"/>
-          <w:sz w:val="26"/>
+          <w:color w:val="1A1D26"/>
+          <w:sz w:val="28"/>
+          <w:u w:val="none"/>
+          <w:rFonts w:ascii="Avenir Next" w:hAnsi="Avenir Next" w:cs="Avenir Next"/>
         </w:rPr>
-        <w:t xml:space="preserve">What we kept the same (the ball, the cup, the surface): </w:t>
+        <w:t xml:space="preserve">From the steeper ramp, that ball made a </w:t>
       </w:r>
       <w:r>
         <w:rPr>
-          <w:rFonts w:ascii="Calibri" w:hAnsi="Calibri" w:cs="Calibri"/>
+          <w:rFonts w:ascii="Avenir Next" w:hAnsi="Avenir Next"/>
           <w:b w:val="0"/>
           <w:i w:val="0"/>
-          <w:color w:val="1F1F1F"/>
-          <w:sz w:val="26"/>
+          <w:color w:val="1A1D26"/>
+          <w:sz w:val="28"/>
           <w:u w:val="single"/>
+          <w:rFonts w:ascii="Avenir Next" w:hAnsi="Avenir Next" w:cs="Avenir Next"/>
         </w:rPr>
         <w:t>________________</w:t>
+      </w:r>
+      <w:r>
+        <w:rPr>
+          <w:rFonts w:ascii="Avenir Next" w:hAnsi="Avenir Next"/>
+          <w:b w:val="0"/>
+          <w:i w:val="0"/>
+          <w:color w:val="1A1D26"/>
+          <w:sz w:val="28"/>
+          <w:u w:val="none"/>
+          <w:rFonts w:ascii="Avenir Next" w:hAnsi="Avenir Next" w:cs="Avenir Next"/>
+        </w:rPr>
+        <w:t xml:space="preserve"> change.</w:t>
       </w:r>
     </w:p>
     <w:p>
       <w:pPr>
-        <w:spacing w:before="100" w:after="40"/>
+        <w:spacing w:before="160" w:after="40"/>
+        <w:pBdr>
+          <w:bottom w:val="single" w:sz="10" w:color="1B4FC2"/>
+        </w:pBdr>
       </w:pPr>
       <w:r>
         <w:rPr>
-          <w:rFonts w:ascii="Calibri" w:hAnsi="Calibri" w:cs="Calibri"/>
+          <w:rFonts w:ascii="Avenir Next" w:hAnsi="Avenir Next"/>
           <w:b/>
           <w:i w:val="0"/>
-          <w:caps/>
-          <w:color w:val="2F3C7E"/>
+          <w:color w:val="5E8A18"/>
           <w:sz w:val="32"/>
+          <w:u w:val="none"/>
+          <w:rFonts w:ascii="Avenir Next" w:hAnsi="Avenir Next" w:cs="Avenir Next"/>
         </w:rPr>
-        <w:t>Ramp It Up! Evidence</w:t>
+        <w:t xml:space="preserve">N4   </w:t>
+      </w:r>
+      <w:r>
+        <w:rPr>
+          <w:rFonts w:ascii="Avenir Next" w:hAnsi="Avenir Next"/>
+          <w:b/>
+          <w:i w:val="0"/>
+          <w:color w:val="1B4FC2"/>
+          <w:sz w:val="32"/>
+          <w:u w:val="none"/>
+          <w:rFonts w:ascii="Avenir Next" w:hAnsi="Avenir Next" w:cs="Avenir Next"/>
+        </w:rPr>
+        <w:t>The Bounce</w:t>
+      </w:r>
+    </w:p>
+    <w:p>
+      <w:pPr>
+        <w:spacing w:before="0" w:after="40"/>
+      </w:pPr>
+      <w:r>
+        <w:rPr>
+          <w:rFonts w:ascii="Avenir Next" w:hAnsi="Avenir Next"/>
+          <w:b w:val="0"/>
+          <w:i/>
+          <w:color w:val="4A5268"/>
+          <w:sz w:val="24"/>
+          <w:u w:val="none"/>
+          <w:rFonts w:ascii="Avenir Next" w:hAnsi="Avenir Next" w:cs="Avenir Next"/>
+        </w:rPr>
+        <w:t>Reader p. 16</w:t>
+      </w:r>
+    </w:p>
+    <w:p>
+      <w:pPr>
+        <w:spacing w:before="0" w:after="120" w:line="520" w:lineRule="exact"/>
+      </w:pPr>
+      <w:r>
+        <w:rPr>
+          <w:rFonts w:ascii="Avenir Next" w:hAnsi="Avenir Next"/>
+          <w:b w:val="0"/>
+          <w:i w:val="0"/>
+          <w:color w:val="1A1D26"/>
+          <w:sz w:val="28"/>
+          <w:u w:val="none"/>
+          <w:rFonts w:ascii="Avenir Next" w:hAnsi="Avenir Next" w:cs="Avenir Next"/>
+        </w:rPr>
+        <w:t xml:space="preserve">The faster ball bounced </w:t>
+      </w:r>
+      <w:r>
+        <w:rPr>
+          <w:rFonts w:ascii="Avenir Next" w:hAnsi="Avenir Next"/>
+          <w:b w:val="0"/>
+          <w:i w:val="0"/>
+          <w:color w:val="1A1D26"/>
+          <w:sz w:val="28"/>
+          <w:u w:val="single"/>
+          <w:rFonts w:ascii="Avenir Next" w:hAnsi="Avenir Next" w:cs="Avenir Next"/>
+        </w:rPr>
+        <w:t>________________</w:t>
+      </w:r>
+      <w:r>
+        <w:rPr>
+          <w:rFonts w:ascii="Avenir Next" w:hAnsi="Avenir Next"/>
+          <w:b w:val="0"/>
+          <w:i w:val="0"/>
+          <w:color w:val="1A1D26"/>
+          <w:sz w:val="28"/>
+          <w:u w:val="none"/>
+          <w:rFonts w:ascii="Avenir Next" w:hAnsi="Avenir Next" w:cs="Avenir Next"/>
+        </w:rPr>
+        <w:t xml:space="preserve"> than the slower ball.</w:t>
+      </w:r>
+    </w:p>
+    <w:p>
+      <w:pPr>
+        <w:spacing w:before="80" w:after="80"/>
+      </w:pPr>
+      <w:r>
+        <w:rPr>
+          <w:rFonts w:ascii="Avenir Next" w:hAnsi="Avenir Next"/>
+          <w:b w:val="0"/>
+          <w:i/>
+          <w:color w:val="4A5268"/>
+          <w:sz w:val="24"/>
+          <w:u w:val="none"/>
+          <w:rFonts w:ascii="Avenir Next" w:hAnsi="Avenir Next" w:cs="Avenir Next"/>
+        </w:rPr>
+        <w:t>A louder sound is also a bigger change you can observe.</w:t>
+      </w:r>
+    </w:p>
+    <w:p>
+      <w:pPr>
+        <w:spacing w:before="160" w:after="40"/>
+        <w:pBdr>
+          <w:bottom w:val="single" w:sz="10" w:color="1B4FC2"/>
+        </w:pBdr>
+      </w:pPr>
+      <w:r>
+        <w:rPr>
+          <w:rFonts w:ascii="Avenir Next" w:hAnsi="Avenir Next"/>
+          <w:b/>
+          <w:i w:val="0"/>
+          <w:color w:val="5E8A18"/>
+          <w:sz w:val="32"/>
+          <w:u w:val="none"/>
+          <w:rFonts w:ascii="Avenir Next" w:hAnsi="Avenir Next" w:cs="Avenir Next"/>
+        </w:rPr>
+        <w:t xml:space="preserve">CHECK   </w:t>
+      </w:r>
+      <w:r>
+        <w:rPr>
+          <w:rFonts w:ascii="Avenir Next" w:hAnsi="Avenir Next"/>
+          <w:b/>
+          <w:i w:val="0"/>
+          <w:color w:val="1B4FC2"/>
+          <w:sz w:val="32"/>
+          <w:u w:val="none"/>
+          <w:rFonts w:ascii="Avenir Next" w:hAnsi="Avenir Next" w:cs="Avenir Next"/>
+        </w:rPr>
+        <w:t>Your Thinking</w:t>
+      </w:r>
+    </w:p>
+    <w:p>
+      <w:pPr>
+        <w:spacing w:before="0" w:after="40"/>
+      </w:pPr>
+      <w:r>
+        <w:rPr>
+          <w:rFonts w:ascii="Avenir Next" w:hAnsi="Avenir Next"/>
+          <w:b/>
+          <w:i w:val="0"/>
+          <w:color w:val="1A1D26"/>
+          <w:sz w:val="29"/>
+          <w:u w:val="none"/>
+          <w:rFonts w:ascii="Avenir Next" w:hAnsi="Avenir Next" w:cs="Avenir Next"/>
+        </w:rPr>
+        <w:t>How are energy and speed related? Name the ball you kept and one change that was bigger.</w:t>
       </w:r>
     </w:p>
     <w:tbl>
@@ -1062,478 +1452,83 @@
         <w:tblW w:type="auto" w:w="0"/>
         <w:tblLook w:firstColumn="1" w:firstRow="1" w:lastColumn="0" w:lastRow="0" w:noHBand="0" w:noVBand="1" w:val="04A0"/>
         <w:tblBorders>
-          <w:top w:val="none" w:sz="0" w:space="0" w:color="FFFFFF"/>
-          <w:left w:val="none" w:sz="0" w:space="0" w:color="FFFFFF"/>
-          <w:bottom w:val="none" w:sz="0" w:space="0" w:color="FFFFFF"/>
-          <w:right w:val="none" w:sz="0" w:space="0" w:color="FFFFFF"/>
-          <w:insideH w:val="none" w:sz="0" w:space="0" w:color="FFFFFF"/>
-          <w:insideV w:val="none" w:sz="0" w:space="0" w:color="FFFFFF"/>
+          <w:top w:val="none"/>
+          <w:left w:val="none"/>
+          <w:bottom w:val="none"/>
+          <w:right w:val="none"/>
+          <w:insideH w:val="none"/>
+          <w:insideV w:val="none"/>
         </w:tblBorders>
       </w:tblPr>
       <w:tblGrid>
-        <w:gridCol w:w="5040"/>
-        <w:gridCol w:w="5040"/>
+        <w:gridCol w:w="10656"/>
       </w:tblGrid>
       <w:tr>
         <w:trPr>
-          <w:trHeight w:val="420" w:hRule="exact"/>
+          <w:trHeight w:val="560" w:hRule="exact"/>
         </w:trPr>
         <w:tc>
           <w:tcPr>
-            <w:tcW w:type="dxa" w:w="3600"/>
+            <w:tcW w:type="dxa" w:w="10656"/>
             <w:tcMar>
-              <w:top w:w="40" w:type="dxa"/>
-              <w:left w:w="60" w:type="dxa"/>
-              <w:bottom w:w="40" w:type="dxa"/>
-              <w:right w:w="60" w:type="dxa"/>
+              <w:top w:w="0" w:type="dxa"/>
+              <w:left w:w="0" w:type="dxa"/>
+              <w:bottom w:w="0" w:type="dxa"/>
+              <w:right w:w="0" w:type="dxa"/>
             </w:tcMar>
-            <w:shd w:fill="2F3C7E"/>
+            <w:tcBorders>
+              <w:bottom w:val="single" w:sz="8" w:color="1A1D26"/>
+            </w:tcBorders>
           </w:tcPr>
           <w:p>
+            <w:pPr>
+              <w:spacing w:before="0" w:after="0" w:line="40" w:lineRule="exact"/>
+            </w:pPr>
             <w:r>
               <w:rPr>
-                <w:rFonts w:ascii="Calibri" w:hAnsi="Calibri" w:cs="Calibri"/>
-                <w:b/>
+                <w:rFonts w:ascii="Avenir Next" w:hAnsi="Avenir Next"/>
+                <w:b w:val="0"/>
                 <w:i w:val="0"/>
-                <w:caps/>
-                <w:color w:val="FFFFFF"/>
-                <w:sz w:val="24"/>
+                <w:color w:val="1A1D26"/>
+                <w:sz w:val="4"/>
+                <w:u w:val="none"/>
+                <w:rFonts w:ascii="Avenir Next" w:hAnsi="Avenir Next" w:cs="Avenir Next"/>
               </w:rPr>
-              <w:t>Ramp height (books)</w:t>
-            </w:r>
-          </w:p>
-        </w:tc>
-        <w:tc>
-          <w:tcPr>
-            <w:tcW w:type="dxa" w:w="3600"/>
-            <w:tcMar>
-              <w:top w:w="40" w:type="dxa"/>
-              <w:left w:w="60" w:type="dxa"/>
-              <w:bottom w:w="40" w:type="dxa"/>
-              <w:right w:w="60" w:type="dxa"/>
-            </w:tcMar>
-            <w:shd w:fill="2F3C7E"/>
-          </w:tcPr>
-          <w:p>
-            <w:r>
-              <w:rPr>
-                <w:rFonts w:ascii="Calibri" w:hAnsi="Calibri" w:cs="Calibri"/>
-                <w:b/>
-                <w:i w:val="0"/>
-                <w:caps/>
-                <w:color w:val="FFFFFF"/>
-                <w:sz w:val="24"/>
-              </w:rPr>
-              <w:t>Cup displacement (cm)</w:t>
             </w:r>
           </w:p>
         </w:tc>
       </w:tr>
       <w:tr>
         <w:trPr>
-          <w:trHeight w:val="700" w:hRule="atLeast"/>
+          <w:trHeight w:val="560" w:hRule="exact"/>
         </w:trPr>
         <w:tc>
           <w:tcPr>
-            <w:tcW w:type="dxa" w:w="3600"/>
+            <w:tcW w:type="dxa" w:w="10656"/>
             <w:tcMar>
-              <w:top w:w="40" w:type="dxa"/>
-              <w:left w:w="60" w:type="dxa"/>
-              <w:bottom w:w="40" w:type="dxa"/>
-              <w:right w:w="60" w:type="dxa"/>
-            </w:tcMar>
-          </w:tcPr>
-          <w:p>
-            <w:pPr>
-              <w:pBdr>
-                <w:bottom w:val="single" w:sz="8" w:space="4" w:color="1F1F1F"/>
-              </w:pBdr>
-            </w:pPr>
-            <w:r>
-              <w:rPr>
-                <w:rFonts w:ascii="Calibri" w:hAnsi="Calibri" w:cs="Calibri"/>
-                <w:b/>
-                <w:i w:val="0"/>
-                <w:color w:val="2F3C7E"/>
-                <w:sz w:val="24"/>
-              </w:rPr>
-              <w:t>1 book</w:t>
-            </w:r>
-          </w:p>
-        </w:tc>
-        <w:tc>
-          <w:tcPr>
-            <w:tcW w:type="dxa" w:w="3600"/>
-            <w:tcMar>
-              <w:top w:w="40" w:type="dxa"/>
-              <w:left w:w="60" w:type="dxa"/>
-              <w:bottom w:w="40" w:type="dxa"/>
-              <w:right w:w="60" w:type="dxa"/>
-            </w:tcMar>
-          </w:tcPr>
-          <w:p>
-            <w:pPr>
-              <w:pBdr>
-                <w:bottom w:val="single" w:sz="8" w:space="4" w:color="1F1F1F"/>
-              </w:pBdr>
-            </w:pPr>
-          </w:p>
-        </w:tc>
-      </w:tr>
-      <w:tr>
-        <w:trPr>
-          <w:trHeight w:val="700" w:hRule="atLeast"/>
-        </w:trPr>
-        <w:tc>
-          <w:tcPr>
-            <w:tcW w:type="dxa" w:w="3600"/>
-            <w:tcMar>
-              <w:top w:w="40" w:type="dxa"/>
-              <w:left w:w="60" w:type="dxa"/>
-              <w:bottom w:w="40" w:type="dxa"/>
-              <w:right w:w="60" w:type="dxa"/>
-            </w:tcMar>
-          </w:tcPr>
-          <w:p>
-            <w:pPr>
-              <w:pBdr>
-                <w:bottom w:val="single" w:sz="8" w:space="4" w:color="1F1F1F"/>
-              </w:pBdr>
-            </w:pPr>
-            <w:r>
-              <w:rPr>
-                <w:rFonts w:ascii="Calibri" w:hAnsi="Calibri" w:cs="Calibri"/>
-                <w:b/>
-                <w:i w:val="0"/>
-                <w:color w:val="2F3C7E"/>
-                <w:sz w:val="24"/>
-              </w:rPr>
-              <w:t>2 books</w:t>
-            </w:r>
-          </w:p>
-        </w:tc>
-        <w:tc>
-          <w:tcPr>
-            <w:tcW w:type="dxa" w:w="3600"/>
-            <w:tcMar>
-              <w:top w:w="40" w:type="dxa"/>
-              <w:left w:w="60" w:type="dxa"/>
-              <w:bottom w:w="40" w:type="dxa"/>
-              <w:right w:w="60" w:type="dxa"/>
-            </w:tcMar>
-          </w:tcPr>
-          <w:p>
-            <w:pPr>
-              <w:pBdr>
-                <w:bottom w:val="single" w:sz="8" w:space="4" w:color="1F1F1F"/>
-              </w:pBdr>
-            </w:pPr>
-          </w:p>
-        </w:tc>
-      </w:tr>
-      <w:tr>
-        <w:trPr>
-          <w:trHeight w:val="700" w:hRule="atLeast"/>
-        </w:trPr>
-        <w:tc>
-          <w:tcPr>
-            <w:tcW w:type="dxa" w:w="3600"/>
-            <w:tcMar>
-              <w:top w:w="40" w:type="dxa"/>
-              <w:left w:w="60" w:type="dxa"/>
-              <w:bottom w:w="40" w:type="dxa"/>
-              <w:right w:w="60" w:type="dxa"/>
-            </w:tcMar>
-          </w:tcPr>
-          <w:p>
-            <w:pPr>
-              <w:pBdr>
-                <w:bottom w:val="single" w:sz="8" w:space="4" w:color="1F1F1F"/>
-              </w:pBdr>
-            </w:pPr>
-            <w:r>
-              <w:rPr>
-                <w:rFonts w:ascii="Calibri" w:hAnsi="Calibri" w:cs="Calibri"/>
-                <w:b/>
-                <w:i w:val="0"/>
-                <w:color w:val="2F3C7E"/>
-                <w:sz w:val="24"/>
-              </w:rPr>
-              <w:t>3 books</w:t>
-            </w:r>
-          </w:p>
-        </w:tc>
-        <w:tc>
-          <w:tcPr>
-            <w:tcW w:type="dxa" w:w="3600"/>
-            <w:tcMar>
-              <w:top w:w="40" w:type="dxa"/>
-              <w:left w:w="60" w:type="dxa"/>
-              <w:bottom w:w="40" w:type="dxa"/>
-              <w:right w:w="60" w:type="dxa"/>
-            </w:tcMar>
-          </w:tcPr>
-          <w:p>
-            <w:pPr>
-              <w:pBdr>
-                <w:bottom w:val="single" w:sz="8" w:space="4" w:color="1F1F1F"/>
-              </w:pBdr>
-            </w:pPr>
-          </w:p>
-        </w:tc>
-      </w:tr>
-    </w:tbl>
-    <w:p>
-      <w:pPr>
-        <w:spacing w:after="40"/>
-      </w:pPr>
-    </w:p>
-    <w:p>
-      <w:pPr>
-        <w:pageBreakBefore/>
-        <w:jc w:val="center"/>
-      </w:pPr>
-      <w:r>
-        <w:rPr>
-          <w:rFonts w:ascii="Cambria" w:hAnsi="Cambria" w:cs="Cambria"/>
-          <w:b/>
-          <w:i w:val="0"/>
-          <w:color w:val="2F3C7E"/>
-          <w:sz w:val="46"/>
-        </w:rPr>
-        <w:t>Claim + Evidence</w:t>
-      </w:r>
-    </w:p>
-    <w:p>
-      <w:pPr>
-        <w:jc w:val="center"/>
-      </w:pPr>
-      <w:r>
-        <w:rPr>
-          <w:rFonts w:ascii="Calibri" w:hAnsi="Calibri" w:cs="Calibri"/>
-          <w:b w:val="0"/>
-          <w:i/>
-          <w:color w:val="555555"/>
-          <w:sz w:val="24"/>
-        </w:rPr>
-        <w:t>Chapter 3 Guided Notes · Page 3</w:t>
-      </w:r>
-    </w:p>
-    <w:p>
-      <w:pPr>
-        <w:spacing w:after="40"/>
-      </w:pPr>
-      <w:r>
-        <w:rPr>
-          <w:rFonts w:ascii="Calibri" w:hAnsi="Calibri" w:cs="Calibri"/>
-          <w:b/>
-          <w:i w:val="0"/>
-          <w:color w:val="1F1F1F"/>
-          <w:sz w:val="24"/>
-        </w:rPr>
-        <w:t xml:space="preserve">Name: </w:t>
-      </w:r>
-      <w:r>
-        <w:rPr>
-          <w:rFonts w:ascii="Calibri" w:hAnsi="Calibri" w:cs="Calibri"/>
-          <w:b w:val="0"/>
-          <w:i w:val="0"/>
-          <w:color w:val="1F1F1F"/>
-          <w:sz w:val="24"/>
-          <w:u w:val="single"/>
-        </w:rPr>
-        <w:t>____________________________</w:t>
-      </w:r>
-      <w:r>
-        <w:rPr>
-          <w:rFonts w:ascii="Calibri" w:hAnsi="Calibri" w:cs="Calibri"/>
-          <w:b/>
-          <w:i w:val="0"/>
-          <w:color w:val="1F1F1F"/>
-          <w:sz w:val="24"/>
-        </w:rPr>
-        <w:t xml:space="preserve">      Date: </w:t>
-      </w:r>
-      <w:r>
-        <w:rPr>
-          <w:rFonts w:ascii="Calibri" w:hAnsi="Calibri" w:cs="Calibri"/>
-          <w:b w:val="0"/>
-          <w:i w:val="0"/>
-          <w:color w:val="1F1F1F"/>
-          <w:sz w:val="24"/>
-          <w:u w:val="single"/>
-        </w:rPr>
-        <w:t>________________</w:t>
-      </w:r>
-    </w:p>
-    <w:p>
-      <w:pPr>
-        <w:spacing w:before="100" w:after="40"/>
-      </w:pPr>
-      <w:r>
-        <w:rPr>
-          <w:rFonts w:ascii="Calibri" w:hAnsi="Calibri" w:cs="Calibri"/>
-          <w:b/>
-          <w:i w:val="0"/>
-          <w:caps/>
-          <w:color w:val="2F3C7E"/>
-          <w:sz w:val="32"/>
-        </w:rPr>
-        <w:t>Make a Claim</w:t>
-      </w:r>
-    </w:p>
-    <w:p>
-      <w:pPr>
-        <w:spacing w:before="0" w:after="30"/>
-      </w:pPr>
-      <w:r>
-        <w:rPr>
-          <w:rFonts w:ascii="Calibri" w:hAnsi="Calibri" w:cs="Calibri"/>
-          <w:b/>
-          <w:i w:val="0"/>
-          <w:color w:val="1F1F1F"/>
-          <w:sz w:val="26"/>
-        </w:rPr>
-        <w:t>Claim: For the SAME object, when it moves faster it has ______ energy of motion, because it caused a ______ change.</w:t>
-      </w:r>
-    </w:p>
-    <w:p>
-      <w:pPr>
-        <w:spacing w:after="60"/>
-      </w:pPr>
-      <w:r>
-        <w:rPr>
-          <w:rFonts w:ascii="Calibri" w:hAnsi="Calibri" w:cs="Calibri"/>
-          <w:b w:val="0"/>
-          <w:i w:val="0"/>
-          <w:color w:val="1F1F1F"/>
-          <w:sz w:val="26"/>
-        </w:rPr>
-        <w:t xml:space="preserve">Evidence from Ramp It Up!: the </w:t>
-      </w:r>
-      <w:r>
-        <w:rPr>
-          <w:rFonts w:ascii="Calibri" w:hAnsi="Calibri" w:cs="Calibri"/>
-          <w:b w:val="0"/>
-          <w:i w:val="0"/>
-          <w:color w:val="1F1F1F"/>
-          <w:sz w:val="26"/>
-          <w:u w:val="single"/>
-        </w:rPr>
-        <w:t>________________</w:t>
-      </w:r>
-      <w:r>
-        <w:rPr>
-          <w:rFonts w:ascii="Calibri" w:hAnsi="Calibri" w:cs="Calibri"/>
-          <w:b w:val="0"/>
-          <w:i w:val="0"/>
-          <w:color w:val="1F1F1F"/>
-          <w:sz w:val="26"/>
-        </w:rPr>
-        <w:t xml:space="preserve"> ramp made the cup move the farthest.</w:t>
-      </w:r>
-    </w:p>
-    <w:p>
-      <w:pPr>
-        <w:spacing w:after="60"/>
-      </w:pPr>
-      <w:r>
-        <w:rPr>
-          <w:rFonts w:ascii="Calibri" w:hAnsi="Calibri" w:cs="Calibri"/>
-          <w:b w:val="0"/>
-          <w:i w:val="0"/>
-          <w:color w:val="1F1F1F"/>
-          <w:sz w:val="26"/>
-        </w:rPr>
-        <w:t xml:space="preserve">In my own words — the relationship: the same object moving faster has </w:t>
-      </w:r>
-      <w:r>
-        <w:rPr>
-          <w:rFonts w:ascii="Calibri" w:hAnsi="Calibri" w:cs="Calibri"/>
-          <w:b w:val="0"/>
-          <w:i w:val="0"/>
-          <w:color w:val="1F1F1F"/>
-          <w:sz w:val="26"/>
-          <w:u w:val="single"/>
-        </w:rPr>
-        <w:t>________________</w:t>
-      </w:r>
-      <w:r>
-        <w:rPr>
-          <w:rFonts w:ascii="Calibri" w:hAnsi="Calibri" w:cs="Calibri"/>
-          <w:b w:val="0"/>
-          <w:i w:val="0"/>
-          <w:color w:val="1F1F1F"/>
-          <w:sz w:val="26"/>
-        </w:rPr>
-        <w:t xml:space="preserve"> energy of motion.</w:t>
-      </w:r>
-    </w:p>
-    <w:p>
-      <w:pPr>
-        <w:spacing w:before="100" w:after="40"/>
-      </w:pPr>
-      <w:r>
-        <w:rPr>
-          <w:rFonts w:ascii="Calibri" w:hAnsi="Calibri" w:cs="Calibri"/>
-          <w:b/>
-          <w:i w:val="0"/>
-          <w:caps/>
-          <w:color w:val="2F3C7E"/>
-          <w:sz w:val="32"/>
-        </w:rPr>
-        <w:t>Graph It</w:t>
-      </w:r>
-    </w:p>
-    <w:tbl>
-      <w:tblPr>
-        <w:tblW w:type="auto" w:w="0"/>
-        <w:tblLook w:firstColumn="1" w:firstRow="1" w:lastColumn="0" w:lastRow="0" w:noHBand="0" w:noVBand="1" w:val="04A0"/>
-        <w:tblBorders>
-          <w:top w:val="none" w:sz="0" w:space="0" w:color="FFFFFF"/>
-          <w:left w:val="none" w:sz="0" w:space="0" w:color="FFFFFF"/>
-          <w:bottom w:val="none" w:sz="0" w:space="0" w:color="FFFFFF"/>
-          <w:right w:val="none" w:sz="0" w:space="0" w:color="FFFFFF"/>
-          <w:insideH w:val="none" w:sz="0" w:space="0" w:color="FFFFFF"/>
-          <w:insideV w:val="none" w:sz="0" w:space="0" w:color="FFFFFF"/>
-        </w:tblBorders>
-      </w:tblPr>
-      <w:tblGrid>
-        <w:gridCol w:w="10080"/>
-      </w:tblGrid>
-      <w:tr>
-        <w:trPr>
-          <w:trHeight w:val="2600" w:hRule="exact"/>
-        </w:trPr>
-        <w:tc>
-          <w:tcPr>
-            <w:tcW w:type="dxa" w:w="10080"/>
-            <w:tcMar>
-              <w:top w:w="20" w:type="dxa"/>
-              <w:left w:w="60" w:type="dxa"/>
-              <w:bottom w:w="20" w:type="dxa"/>
-              <w:right w:w="60" w:type="dxa"/>
+              <w:top w:w="0" w:type="dxa"/>
+              <w:left w:w="0" w:type="dxa"/>
+              <w:bottom w:w="0" w:type="dxa"/>
+              <w:right w:w="0" w:type="dxa"/>
             </w:tcMar>
             <w:tcBorders>
-              <w:top w:sz="8" w:val="single" w:color="2F3C7E"/>
-              <w:left w:sz="8" w:val="single" w:color="2F3C7E"/>
-              <w:bottom w:sz="8" w:val="single" w:color="2F3C7E"/>
-              <w:right w:sz="8" w:val="single" w:color="2F3C7E"/>
+              <w:bottom w:val="single" w:sz="8" w:color="1A1D26"/>
             </w:tcBorders>
           </w:tcPr>
           <w:p>
             <w:pPr>
-              <w:jc w:val="center"/>
+              <w:spacing w:before="0" w:after="0" w:line="40" w:lineRule="exact"/>
             </w:pPr>
             <w:r>
               <w:rPr>
-                <w:rFonts w:ascii="Calibri" w:hAnsi="Calibri" w:cs="Calibri"/>
+                <w:rFonts w:ascii="Avenir Next" w:hAnsi="Avenir Next"/>
                 <w:b w:val="0"/>
-                <w:i/>
-                <w:color w:val="555555"/>
-                <w:sz w:val="24"/>
+                <w:i w:val="0"/>
+                <w:color w:val="1A1D26"/>
+                <w:sz w:val="4"/>
+                <w:u w:val="none"/>
+                <w:rFonts w:ascii="Avenir Next" w:hAnsi="Avenir Next" w:cs="Avenir Next"/>
               </w:rPr>
-              <w:t>draw or sketch a bar graph of ramp height vs cup displacement</w:t>
             </w:r>
           </w:p>
         </w:tc>
@@ -1541,49 +1536,7 @@
     </w:tbl>
     <w:p>
       <w:pPr>
-        <w:spacing w:before="100" w:after="40"/>
-      </w:pPr>
-      <w:r>
-        <w:rPr>
-          <w:rFonts w:ascii="Calibri" w:hAnsi="Calibri" w:cs="Calibri"/>
-          <w:b/>
-          <w:i w:val="0"/>
-          <w:caps/>
-          <w:color w:val="2F3C7E"/>
-          <w:sz w:val="32"/>
-        </w:rPr>
-        <w:t>Check Your Thinking</w:t>
-      </w:r>
-    </w:p>
-    <w:p>
-      <w:pPr>
-        <w:spacing w:before="0" w:after="30"/>
-      </w:pPr>
-      <w:r>
-        <w:rPr>
-          <w:rFonts w:ascii="Calibri" w:hAnsi="Calibri" w:cs="Calibri"/>
-          <w:b/>
-          <w:i w:val="0"/>
-          <w:color w:val="1F1F1F"/>
-          <w:sz w:val="26"/>
-        </w:rPr>
-        <w:t>Why do we compare the SAME object instead of a heavy ball and a light ball?</w:t>
-      </w:r>
-    </w:p>
-    <w:p>
-      <w:pPr>
-        <w:spacing w:after="360" w:line="600" w:lineRule="exact"/>
-        <w:pBdr>
-          <w:bottom w:val="single" w:sz="8" w:space="4" w:color="1F1F1F"/>
-        </w:pBdr>
-      </w:pPr>
-    </w:p>
-    <w:p>
-      <w:pPr>
-        <w:spacing w:after="360" w:line="600" w:lineRule="exact"/>
-        <w:pBdr>
-          <w:bottom w:val="single" w:sz="8" w:space="4" w:color="1F1F1F"/>
-        </w:pBdr>
+        <w:spacing w:before="0" w:after="120"/>
       </w:pPr>
     </w:p>
     <w:tbl>
@@ -1591,63 +1544,206 @@
         <w:tblW w:type="auto" w:w="0"/>
         <w:tblLook w:firstColumn="1" w:firstRow="1" w:lastColumn="0" w:lastRow="0" w:noHBand="0" w:noVBand="1" w:val="04A0"/>
         <w:tblBorders>
-          <w:top w:val="none" w:sz="0" w:space="0" w:color="FFFFFF"/>
-          <w:left w:val="none" w:sz="0" w:space="0" w:color="FFFFFF"/>
-          <w:bottom w:val="none" w:sz="0" w:space="0" w:color="FFFFFF"/>
-          <w:right w:val="none" w:sz="0" w:space="0" w:color="FFFFFF"/>
-          <w:insideH w:val="none" w:sz="0" w:space="0" w:color="FFFFFF"/>
-          <w:insideV w:val="none" w:sz="0" w:space="0" w:color="FFFFFF"/>
+          <w:top w:val="none"/>
+          <w:left w:val="none"/>
+          <w:bottom w:val="none"/>
+          <w:right w:val="none"/>
+          <w:insideH w:val="none"/>
+          <w:insideV w:val="none"/>
         </w:tblBorders>
       </w:tblPr>
       <w:tblGrid>
-        <w:gridCol w:w="10080"/>
+        <w:gridCol w:w="10656"/>
       </w:tblGrid>
       <w:tr>
         <w:tc>
           <w:tcPr>
-            <w:tcW w:type="dxa" w:w="10080"/>
+            <w:tcW w:type="dxa" w:w="10656"/>
             <w:tcMar>
-              <w:top w:w="50" w:type="dxa"/>
-              <w:left w:w="100" w:type="dxa"/>
-              <w:bottom w:w="50" w:type="dxa"/>
-              <w:right w:w="100" w:type="dxa"/>
+              <w:top w:w="70" w:type="dxa"/>
+              <w:left w:w="110" w:type="dxa"/>
+              <w:bottom w:w="70" w:type="dxa"/>
+              <w:right w:w="110" w:type="dxa"/>
             </w:tcMar>
-            <w:shd w:fill="E8EAF2"/>
+            <w:shd w:val="clear" w:color="auto" w:fill="1B4FC2"/>
+            <w:vAlign w:val="center"/>
           </w:tcPr>
           <w:p>
             <w:r>
               <w:rPr>
-                <w:rFonts w:ascii="Calibri" w:hAnsi="Calibri" w:cs="Calibri"/>
+                <w:rFonts w:ascii="Avenir Next" w:hAnsi="Avenir Next"/>
                 <w:b/>
                 <w:i w:val="0"/>
-                <w:caps/>
-                <w:color w:val="2F3C7E"/>
-                <w:sz w:val="24"/>
+                <w:color w:val="FFFFFF"/>
+                <w:sz w:val="30"/>
+                <w:u w:val="none"/>
+                <w:rFonts w:ascii="Avenir Next" w:hAnsi="Avenir Next" w:cs="Avenir Next"/>
               </w:rPr>
-              <w:t xml:space="preserve">CONNECT   </w:t>
+              <w:t>BQ  ·  NOW I THINK    How are energy and speed related?</w:t>
             </w:r>
+          </w:p>
+        </w:tc>
+      </w:tr>
+    </w:tbl>
+    <w:p>
+      <w:pPr>
+        <w:spacing w:before="0" w:after="80"/>
+      </w:pPr>
+    </w:p>
+    <w:tbl>
+      <w:tblPr>
+        <w:tblW w:type="auto" w:w="0"/>
+        <w:tblLook w:firstColumn="1" w:firstRow="1" w:lastColumn="0" w:lastRow="0" w:noHBand="0" w:noVBand="1" w:val="04A0"/>
+        <w:tblBorders>
+          <w:top w:val="none"/>
+          <w:left w:val="none"/>
+          <w:bottom w:val="none"/>
+          <w:right w:val="none"/>
+          <w:insideH w:val="none"/>
+          <w:insideV w:val="none"/>
+        </w:tblBorders>
+      </w:tblPr>
+      <w:tblGrid>
+        <w:gridCol w:w="10656"/>
+      </w:tblGrid>
+      <w:tr>
+        <w:trPr>
+          <w:trHeight w:val="560" w:hRule="exact"/>
+        </w:trPr>
+        <w:tc>
+          <w:tcPr>
+            <w:tcW w:type="dxa" w:w="10656"/>
+            <w:tcMar>
+              <w:top w:w="0" w:type="dxa"/>
+              <w:left w:w="0" w:type="dxa"/>
+              <w:bottom w:w="0" w:type="dxa"/>
+              <w:right w:w="0" w:type="dxa"/>
+            </w:tcMar>
+            <w:tcBorders>
+              <w:bottom w:val="single" w:sz="8" w:color="1A1D26"/>
+            </w:tcBorders>
+          </w:tcPr>
+          <w:p>
+            <w:pPr>
+              <w:spacing w:before="0" w:after="0" w:line="40" w:lineRule="exact"/>
+            </w:pPr>
             <w:r>
               <w:rPr>
-                <w:rFonts w:ascii="Calibri" w:hAnsi="Calibri" w:cs="Calibri"/>
+                <w:rFonts w:ascii="Avenir Next" w:hAnsi="Avenir Next"/>
                 <w:b w:val="0"/>
-                <w:i/>
-                <w:color w:val="1F1F1F"/>
-                <w:sz w:val="24"/>
+                <w:i w:val="0"/>
+                <w:color w:val="1A1D26"/>
+                <w:sz w:val="4"/>
+                <w:u w:val="none"/>
+                <w:rFonts w:ascii="Avenir Next" w:hAnsi="Avenir Next" w:cs="Avenir Next"/>
               </w:rPr>
-              <w:t>Chapter 1 → 2 → 3: energy causes change; moving objects have energy; faster (same object) = more energy of motion.</w:t>
+            </w:r>
+          </w:p>
+        </w:tc>
+      </w:tr>
+      <w:tr>
+        <w:trPr>
+          <w:trHeight w:val="560" w:hRule="exact"/>
+        </w:trPr>
+        <w:tc>
+          <w:tcPr>
+            <w:tcW w:type="dxa" w:w="10656"/>
+            <w:tcMar>
+              <w:top w:w="0" w:type="dxa"/>
+              <w:left w:w="0" w:type="dxa"/>
+              <w:bottom w:w="0" w:type="dxa"/>
+              <w:right w:w="0" w:type="dxa"/>
+            </w:tcMar>
+            <w:tcBorders>
+              <w:bottom w:val="single" w:sz="8" w:color="1A1D26"/>
+            </w:tcBorders>
+          </w:tcPr>
+          <w:p>
+            <w:pPr>
+              <w:spacing w:before="0" w:after="0" w:line="40" w:lineRule="exact"/>
+            </w:pPr>
+            <w:r>
+              <w:rPr>
+                <w:rFonts w:ascii="Avenir Next" w:hAnsi="Avenir Next"/>
+                <w:b w:val="0"/>
+                <w:i w:val="0"/>
+                <w:color w:val="1A1D26"/>
+                <w:sz w:val="4"/>
+                <w:u w:val="none"/>
+                <w:rFonts w:ascii="Avenir Next" w:hAnsi="Avenir Next" w:cs="Avenir Next"/>
+              </w:rPr>
+            </w:r>
+          </w:p>
+        </w:tc>
+      </w:tr>
+      <w:tr>
+        <w:trPr>
+          <w:trHeight w:val="560" w:hRule="exact"/>
+        </w:trPr>
+        <w:tc>
+          <w:tcPr>
+            <w:tcW w:type="dxa" w:w="10656"/>
+            <w:tcMar>
+              <w:top w:w="0" w:type="dxa"/>
+              <w:left w:w="0" w:type="dxa"/>
+              <w:bottom w:w="0" w:type="dxa"/>
+              <w:right w:w="0" w:type="dxa"/>
+            </w:tcMar>
+            <w:tcBorders>
+              <w:bottom w:val="single" w:sz="8" w:color="1A1D26"/>
+            </w:tcBorders>
+          </w:tcPr>
+          <w:p>
+            <w:pPr>
+              <w:spacing w:before="0" w:after="0" w:line="40" w:lineRule="exact"/>
+            </w:pPr>
+            <w:r>
+              <w:rPr>
+                <w:rFonts w:ascii="Avenir Next" w:hAnsi="Avenir Next"/>
+                <w:b w:val="0"/>
+                <w:i w:val="0"/>
+                <w:color w:val="1A1D26"/>
+                <w:sz w:val="4"/>
+                <w:u w:val="none"/>
+                <w:rFonts w:ascii="Avenir Next" w:hAnsi="Avenir Next" w:cs="Avenir Next"/>
+              </w:rPr>
             </w:r>
           </w:p>
         </w:tc>
       </w:tr>
     </w:tbl>
     <w:sectPr>
+      <w:footerReference w:type="default" r:id="rId9"/>
       <w:pgSz w:w="12240" w:h="15840"/>
-      <w:pgMar w:top="1008" w:right="1080" w:bottom="1008" w:left="1080" w:header="720" w:footer="720" w:gutter="0"/>
+      <w:pgMar w:top="720" w:right="792" w:bottom="720" w:left="792" w:header="720" w:footer="720" w:gutter="0"/>
       <w:cols w:space="720"/>
       <w:docGrid w:linePitch="360"/>
     </w:sectPr>
   </w:body>
 </w:document>
+</file>
+
+<file path=word/footer1.xml><?xml version="1.0" encoding="utf-8"?>
+<w:ftr xmlns:m="http://schemas.openxmlformats.org/officeDocument/2006/math" xmlns:mc="http://schemas.openxmlformats.org/markup-compatibility/2006" xmlns:mo="http://schemas.microsoft.com/office/mac/office/2008/main" xmlns:mv="urn:schemas-microsoft-com:mac:vml" xmlns:o="urn:schemas-microsoft-com:office:office" xmlns:r="http://schemas.openxmlformats.org/officeDocument/2006/relationships" xmlns:v="urn:schemas-microsoft-com:vml" xmlns:w10="urn:schemas-microsoft-com:office:word" xmlns:w14="http://schemas.microsoft.com/office/word/2010/wordml" xmlns:w="http://schemas.openxmlformats.org/wordprocessingml/2006/main" xmlns:wne="http://schemas.microsoft.com/office/word/2006/wordml" xmlns:wp14="http://schemas.microsoft.com/office/word/2010/wordprocessingDrawing" xmlns:wp="http://schemas.openxmlformats.org/drawingml/2006/wordprocessingDrawing" xmlns:wpc="http://schemas.microsoft.com/office/word/2010/wordprocessingCanvas" xmlns:wpg="http://schemas.microsoft.com/office/word/2010/wordprocessingGroup" xmlns:wpi="http://schemas.microsoft.com/office/word/2010/wordprocessingInk" xmlns:wps="http://schemas.microsoft.com/office/word/2010/wordprocessingShape" mc:Ignorable="w14 wp14">
+  <w:p>
+    <w:pPr>
+      <w:pStyle w:val="Footer"/>
+      <w:jc w:val="center"/>
+    </w:pPr>
+    <w:r>
+      <w:rPr>
+        <w:rFonts w:ascii="Avenir Next" w:hAnsi="Avenir Next"/>
+        <w:b w:val="0"/>
+        <w:i w:val="0"/>
+        <w:color w:val="4A5268"/>
+        <w:sz w:val="24"/>
+        <w:u w:val="none"/>
+        <w:rFonts w:ascii="Avenir Next" w:hAnsi="Avenir Next" w:cs="Avenir Next"/>
+      </w:rPr>
+      <w:t>Unit 1  ·  Chapter 3  ·  Guided Notes  ·  Energy and Speed Are Related</w:t>
+    </w:r>
+  </w:p>
+</w:ftr>
 </file>
 
 <file path=word/numbering.xml><?xml version="1.0" encoding="utf-8"?>
@@ -2013,6 +2109,11 @@
     <w:name w:val="Normal"/>
     <w:qFormat/>
     <w:rsid w:val="00FC693F"/>
+    <w:rPr>
+      <w:rFonts w:ascii="Avenir Next" w:hAnsi="Avenir Next"/>
+      <w:color w:val="1A1D26"/>
+      <w:sz w:val="28"/>
+    </w:rPr>
   </w:style>
   <w:style w:type="paragraph" w:styleId="Header">
     <w:name w:val="header"/>

</xml_diff>